<commit_message>
docs: focus requirements on the guided learning core
Drop the quiz, diagram and reading use cases and renumber the remaining
use cases to UC01-UC08. Rewrite note taking as a single use case where
the learner takes notes while studying and can ask the AI to write or
edit them. Accept Word and PowerPoint files in the document library.

Redraw the overall and affected decomposition diagrams, update the
overview diagram source, regenerate the Word export and trim the README
feature list to match.
</commit_message>
<xml_diff>
--- a/report/chuong-2-phan-tich-yeu-cau.docx
+++ b/report/chuong-2-phan-tich-yeu-cau.docx
@@ -175,7 +175,7 @@
           <w:sz w:val="26"/>
           <w:szCs w:val="26"/>
         </w:rPr>
-        <w:t xml:space="preserve"> Người học có thể hỏi đáp với AI, đọc tài liệu cùng AI, làm quiz luyện tập và vẽ sơ đồ minh họa. Kết quả của mỗi hoạt động được lưu lại và dùng lại làm nguồn cho hoạt động khác.</w:t>
+        <w:t xml:space="preserve"> Bên cạnh lộ trình, người học có thể hỏi đáp với AI trên tài liệu của mình và ghi chép trong lúc học, có AI ghi chép giúp. Kết quả của mỗi hoạt động được lưu lại và dùng lại làm nguồn cho hoạt động khác.</w:t>
       </w:r>
     </w:p>
     <w:p>
@@ -514,7 +514,7 @@
           <w:sz w:val="26"/>
           <w:szCs w:val="26"/>
         </w:rPr>
-        <w:t xml:space="preserve">Bên cạnh quy trình này, người học dùng các hoạt động hỗ trợ khi cần: hỏi đáp tự do, hỏi trên tài liệu đang đọc, làm quiz hoặc yêu cầu một sơ đồ minh họa. Kết quả đáng giữ được lưu vào sổ ghi chép để dùng lại. Toàn bộ nội dung được tổ chức theo không gian học, ví dụ mỗi môn học một không gian.</w:t>
+        <w:t xml:space="preserve">Bên cạnh quy trình này, người học hỏi đáp tự do với AI khi cần và ghi chép trong lúc học; AI có thể ghi chép giúp khi người học yêu cầu. Ghi chép được dùng lại làm nguồn cho các lần học sau. Toàn bộ nội dung được tổ chức theo không gian học, ví dụ mỗi môn học một không gian.</w:t>
       </w:r>
     </w:p>
     <w:p>
@@ -552,7 +552,7 @@
           <w:sz w:val="26"/>
           <w:szCs w:val="26"/>
         </w:rPr>
-        <w:t xml:space="preserve">Hệ thống là một ứng dụng web, mỗi người dùng có tài khoản và dữ liệu riêng. Việc sinh câu trả lời, xử lý tài liệu để tra cứu và tìm kiếm trên web do các dịch vụ AI bên ngoài đảm nhận; hệ thống không tự huấn luyện hay vận hành mô hình ngôn ngữ. Hệ thống làm việc với tài liệu dạng PDF, văn bản và Markdown; sơ đồ minh họa gồm bốn kiểu: sơ đồ khái niệm, lưu đồ, dòng thời gian và sơ đồ so sánh.</w:t>
+        <w:t xml:space="preserve">Hệ thống là một ứng dụng web, mỗi người dùng có tài khoản và dữ liệu riêng. Việc sinh câu trả lời, xử lý tài liệu để tra cứu và tìm kiếm trên web do các dịch vụ AI bên ngoài đảm nhận; hệ thống không tự huấn luyện hay vận hành mô hình ngôn ngữ. Hệ thống làm việc với tài liệu dạng PDF, Word, PowerPoint, văn bản và Markdown.</w:t>
       </w:r>
     </w:p>
     <w:p>
@@ -569,7 +569,7 @@
           <w:sz w:val="26"/>
           <w:szCs w:val="26"/>
         </w:rPr>
-        <w:t xml:space="preserve">Các nội dung sau nằm ngoài phạm vi: học qua video và âm thanh, sinh ảnh và video, tương tác bằng giọng nói, sách do AI viết, tài liệu Word, Excel và PowerPoint, ứng dụng di động, tổ chức và lớp học, phân quyền nhiều cấp.</w:t>
+        <w:t xml:space="preserve">Các nội dung sau nằm ngoài phạm vi: học qua video và âm thanh, sinh ảnh và video, tương tác bằng giọng nói, sách do AI viết, tài liệu Excel, ứng dụng di động, tổ chức và lớp học, phân quyền nhiều cấp.</w:t>
       </w:r>
     </w:p>
     <w:p>
@@ -1222,7 +1222,7 @@
           <w:sz w:val="26"/>
           <w:szCs w:val="26"/>
         </w:rPr>
-        <w:t xml:space="preserve">Hình 2.3 mô tả quan hệ giữa các tác nhân và chức năng của hệ thống. Khách tham gia ca sử dụng quản lý tài khoản cá nhân; người học tham gia chín ca sử dụng đầu; quản trị viên có toàn bộ ca sử dụng của người học và có thêm ca sử dụng quản trị hệ thống. Danh sách ca sử dụng được thống kê trong Bảng 2.2.</w:t>
+        <w:t xml:space="preserve">Hình 2.3 mô tả quan hệ giữa các tác nhân và chức năng của hệ thống. Khách tham gia ca sử dụng quản lý tài khoản cá nhân; người học tham gia bảy ca sử dụng đầu; quản trị viên có toàn bộ ca sử dụng của người học và có thêm ca sử dụng quản trị hệ thống. Danh sách ca sử dụng được thống kê trong Bảng 2.2.</w:t>
       </w:r>
     </w:p>
     <w:p>
@@ -1234,7 +1234,7 @@
       <w:r>
         <w:drawing>
           <wp:inline distT="0" distB="0" distL="0" distR="0">
-            <wp:extent cx="4476750" cy="3962400"/>
+            <wp:extent cx="4476750" cy="3286125"/>
             <wp:effectExtent t="0" r="0" b="0" l="0"/>
             <wp:docPr id="3" name="Hình 2.3. Biểu đồ ca sử dụng tổng quát của hệ thống Masterly" descr="Hình 2.3. Biểu đồ ca sử dụng tổng quát của hệ thống Masterly" title="Hình 2.3. Biểu đồ ca sử dụng tổng quát của hệ thống Masterly"/>
             <wp:cNvGraphicFramePr>
@@ -1259,7 +1259,7 @@
                   <pic:spPr bwMode="auto">
                     <a:xfrm>
                       <a:off x="0" y="0"/>
-                      <a:ext cx="4476750" cy="3962400"/>
+                      <a:ext cx="4476750" cy="3286125"/>
                     </a:xfrm>
                     <a:prstGeom prst="rect">
                       <a:avLst/>
@@ -1827,7 +1827,7 @@
                 <w:sz w:val="24"/>
                 <w:szCs w:val="24"/>
               </w:rPr>
-              <w:t xml:space="preserve">Làm quiz luyện tập</w:t>
+              <w:t xml:space="preserve">Quản lý tài liệu học</w:t>
             </w:r>
           </w:p>
         </w:tc>
@@ -1935,7 +1935,7 @@
                 <w:sz w:val="24"/>
                 <w:szCs w:val="24"/>
               </w:rPr>
-              <w:t xml:space="preserve">Vẽ sơ đồ minh họa</w:t>
+              <w:t xml:space="preserve">Ghi chép</w:t>
             </w:r>
           </w:p>
         </w:tc>
@@ -2043,7 +2043,7 @@
                 <w:sz w:val="24"/>
                 <w:szCs w:val="24"/>
               </w:rPr>
-              <w:t xml:space="preserve">Quản lý tài liệu học</w:t>
+              <w:t xml:space="preserve">Quản lý bộ nhớ người học</w:t>
             </w:r>
           </w:p>
         </w:tc>
@@ -2151,7 +2151,7 @@
                 <w:sz w:val="24"/>
                 <w:szCs w:val="24"/>
               </w:rPr>
-              <w:t xml:space="preserve">Ghi chép</w:t>
+              <w:t xml:space="preserve">Quản lý không gian học</w:t>
             </w:r>
           </w:p>
         </w:tc>
@@ -2259,222 +2259,6 @@
                 <w:sz w:val="24"/>
                 <w:szCs w:val="24"/>
               </w:rPr>
-              <w:t xml:space="preserve">Quản lý bộ nhớ người học</w:t>
-            </w:r>
-          </w:p>
-        </w:tc>
-        <w:tc>
-          <w:tcPr>
-            <w:tcW w:type="dxa" w:w="3174"/>
-            <w:tcBorders>
-              <w:top w:val="single" w:color="000000" w:sz="4"/>
-              <w:left w:val="single" w:color="000000" w:sz="4"/>
-              <w:bottom w:val="single" w:color="000000" w:sz="4"/>
-              <w:right w:val="single" w:color="000000" w:sz="4"/>
-            </w:tcBorders>
-            <w:tcMar>
-              <w:top w:type="dxa" w:w="60"/>
-              <w:left w:type="dxa" w:w="100"/>
-              <w:bottom w:type="dxa" w:w="60"/>
-              <w:right w:type="dxa" w:w="100"/>
-            </w:tcMar>
-            <w:vAlign w:val="top"/>
-          </w:tcPr>
-          <w:p>
-            <w:pPr>
-              <w:spacing w:after="0" w:before="0" w:line="276"/>
-              <w:jc w:val="left"/>
-            </w:pPr>
-            <w:r>
-              <w:rPr>
-                <w:rFonts w:ascii="Times New Roman" w:cs="Times New Roman" w:eastAsia="Times New Roman" w:hAnsi="Times New Roman"/>
-                <w:b w:val="false"/>
-                <w:bCs w:val="false"/>
-                <w:sz w:val="24"/>
-                <w:szCs w:val="24"/>
-              </w:rPr>
-              <w:t xml:space="preserve">Người học</w:t>
-            </w:r>
-          </w:p>
-        </w:tc>
-      </w:tr>
-      <w:tr>
-        <w:trPr>
-          <w:cantSplit/>
-          <w:tblHeader w:val="off"/>
-        </w:trPr>
-        <w:tc>
-          <w:tcPr>
-            <w:tcW w:type="dxa" w:w="1089"/>
-            <w:tcBorders>
-              <w:top w:val="single" w:color="000000" w:sz="4"/>
-              <w:left w:val="single" w:color="000000" w:sz="4"/>
-              <w:bottom w:val="single" w:color="000000" w:sz="4"/>
-              <w:right w:val="single" w:color="000000" w:sz="4"/>
-            </w:tcBorders>
-            <w:tcMar>
-              <w:top w:type="dxa" w:w="60"/>
-              <w:left w:type="dxa" w:w="100"/>
-              <w:bottom w:type="dxa" w:w="60"/>
-              <w:right w:type="dxa" w:w="100"/>
-            </w:tcMar>
-            <w:vAlign w:val="top"/>
-          </w:tcPr>
-          <w:p>
-            <w:pPr>
-              <w:spacing w:after="0" w:before="0" w:line="276"/>
-              <w:jc w:val="left"/>
-            </w:pPr>
-            <w:r>
-              <w:rPr>
-                <w:rFonts w:ascii="Times New Roman" w:cs="Times New Roman" w:eastAsia="Times New Roman" w:hAnsi="Times New Roman"/>
-                <w:b w:val="false"/>
-                <w:bCs w:val="false"/>
-                <w:sz w:val="24"/>
-                <w:szCs w:val="24"/>
-              </w:rPr>
-              <w:t xml:space="preserve">UC09</w:t>
-            </w:r>
-          </w:p>
-        </w:tc>
-        <w:tc>
-          <w:tcPr>
-            <w:tcW w:type="dxa" w:w="4808"/>
-            <w:tcBorders>
-              <w:top w:val="single" w:color="000000" w:sz="4"/>
-              <w:left w:val="single" w:color="000000" w:sz="4"/>
-              <w:bottom w:val="single" w:color="000000" w:sz="4"/>
-              <w:right w:val="single" w:color="000000" w:sz="4"/>
-            </w:tcBorders>
-            <w:tcMar>
-              <w:top w:type="dxa" w:w="60"/>
-              <w:left w:type="dxa" w:w="100"/>
-              <w:bottom w:type="dxa" w:w="60"/>
-              <w:right w:type="dxa" w:w="100"/>
-            </w:tcMar>
-            <w:vAlign w:val="top"/>
-          </w:tcPr>
-          <w:p>
-            <w:pPr>
-              <w:spacing w:after="0" w:before="0" w:line="276"/>
-              <w:jc w:val="left"/>
-            </w:pPr>
-            <w:r>
-              <w:rPr>
-                <w:rFonts w:ascii="Times New Roman" w:cs="Times New Roman" w:eastAsia="Times New Roman" w:hAnsi="Times New Roman"/>
-                <w:b w:val="false"/>
-                <w:bCs w:val="false"/>
-                <w:sz w:val="24"/>
-                <w:szCs w:val="24"/>
-              </w:rPr>
-              <w:t xml:space="preserve">Quản lý không gian học</w:t>
-            </w:r>
-          </w:p>
-        </w:tc>
-        <w:tc>
-          <w:tcPr>
-            <w:tcW w:type="dxa" w:w="3174"/>
-            <w:tcBorders>
-              <w:top w:val="single" w:color="000000" w:sz="4"/>
-              <w:left w:val="single" w:color="000000" w:sz="4"/>
-              <w:bottom w:val="single" w:color="000000" w:sz="4"/>
-              <w:right w:val="single" w:color="000000" w:sz="4"/>
-            </w:tcBorders>
-            <w:tcMar>
-              <w:top w:type="dxa" w:w="60"/>
-              <w:left w:type="dxa" w:w="100"/>
-              <w:bottom w:type="dxa" w:w="60"/>
-              <w:right w:type="dxa" w:w="100"/>
-            </w:tcMar>
-            <w:vAlign w:val="top"/>
-          </w:tcPr>
-          <w:p>
-            <w:pPr>
-              <w:spacing w:after="0" w:before="0" w:line="276"/>
-              <w:jc w:val="left"/>
-            </w:pPr>
-            <w:r>
-              <w:rPr>
-                <w:rFonts w:ascii="Times New Roman" w:cs="Times New Roman" w:eastAsia="Times New Roman" w:hAnsi="Times New Roman"/>
-                <w:b w:val="false"/>
-                <w:bCs w:val="false"/>
-                <w:sz w:val="24"/>
-                <w:szCs w:val="24"/>
-              </w:rPr>
-              <w:t xml:space="preserve">Người học</w:t>
-            </w:r>
-          </w:p>
-        </w:tc>
-      </w:tr>
-      <w:tr>
-        <w:trPr>
-          <w:cantSplit/>
-          <w:tblHeader w:val="off"/>
-        </w:trPr>
-        <w:tc>
-          <w:tcPr>
-            <w:tcW w:type="dxa" w:w="1089"/>
-            <w:tcBorders>
-              <w:top w:val="single" w:color="000000" w:sz="4"/>
-              <w:left w:val="single" w:color="000000" w:sz="4"/>
-              <w:bottom w:val="single" w:color="000000" w:sz="4"/>
-              <w:right w:val="single" w:color="000000" w:sz="4"/>
-            </w:tcBorders>
-            <w:tcMar>
-              <w:top w:type="dxa" w:w="60"/>
-              <w:left w:type="dxa" w:w="100"/>
-              <w:bottom w:type="dxa" w:w="60"/>
-              <w:right w:type="dxa" w:w="100"/>
-            </w:tcMar>
-            <w:vAlign w:val="top"/>
-          </w:tcPr>
-          <w:p>
-            <w:pPr>
-              <w:spacing w:after="0" w:before="0" w:line="276"/>
-              <w:jc w:val="left"/>
-            </w:pPr>
-            <w:r>
-              <w:rPr>
-                <w:rFonts w:ascii="Times New Roman" w:cs="Times New Roman" w:eastAsia="Times New Roman" w:hAnsi="Times New Roman"/>
-                <w:b w:val="false"/>
-                <w:bCs w:val="false"/>
-                <w:sz w:val="24"/>
-                <w:szCs w:val="24"/>
-              </w:rPr>
-              <w:t xml:space="preserve">UC10</w:t>
-            </w:r>
-          </w:p>
-        </w:tc>
-        <w:tc>
-          <w:tcPr>
-            <w:tcW w:type="dxa" w:w="4808"/>
-            <w:tcBorders>
-              <w:top w:val="single" w:color="000000" w:sz="4"/>
-              <w:left w:val="single" w:color="000000" w:sz="4"/>
-              <w:bottom w:val="single" w:color="000000" w:sz="4"/>
-              <w:right w:val="single" w:color="000000" w:sz="4"/>
-            </w:tcBorders>
-            <w:tcMar>
-              <w:top w:type="dxa" w:w="60"/>
-              <w:left w:type="dxa" w:w="100"/>
-              <w:bottom w:type="dxa" w:w="60"/>
-              <w:right w:type="dxa" w:w="100"/>
-            </w:tcMar>
-            <w:vAlign w:val="top"/>
-          </w:tcPr>
-          <w:p>
-            <w:pPr>
-              <w:spacing w:after="0" w:before="0" w:line="276"/>
-              <w:jc w:val="left"/>
-            </w:pPr>
-            <w:r>
-              <w:rPr>
-                <w:rFonts w:ascii="Times New Roman" w:cs="Times New Roman" w:eastAsia="Times New Roman" w:hAnsi="Times New Roman"/>
-                <w:b w:val="false"/>
-                <w:bCs w:val="false"/>
-                <w:sz w:val="24"/>
-                <w:szCs w:val="24"/>
-              </w:rPr>
               <w:t xml:space="preserve">Quản trị hệ thống</w:t>
             </w:r>
           </w:p>
@@ -2555,7 +2339,7 @@
           <w:sz w:val="26"/>
           <w:szCs w:val="26"/>
         </w:rPr>
-        <w:t xml:space="preserve">Mỗi ca sử dụng có một biểu đồ ca sử dụng phân rã thể hiện các ca sử dụng con. Tác nhân nối trực tiếp với những ca sử dụng con mà tác nhân tự bắt đầu; quan hệ «include» chỉ ca sử dụng con luôn được thực hiện cùng ca sử dụng chính, quan hệ «extend» chỉ ca sử dụng con tùy chọn, chỉ xảy ra bên trong ca sử dụng chính. Ba ca sử dụng thuộc phần học chính (UC02, UC03, UC04) được đặc tả đầy đủ với luồng cơ bản, luồng thay thế và quy tắc; các ca sử dụng còn lại được đặc tả gọn qua mô tả, các chức năng và quy tắc. Những điều kiện sau áp dụng chung cho mọi ca sử dụng, trừ UC01:</w:t>
+        <w:t xml:space="preserve">Mỗi ca sử dụng có một biểu đồ ca sử dụng phân rã thể hiện các ca sử dụng con. Tác nhân nối trực tiếp với những ca sử dụng con mà tác nhân tự bắt đầu; quan hệ «include» chỉ ca sử dụng con luôn được thực hiện cùng ca sử dụng chính, quan hệ «extend» chỉ ca sử dụng con tùy chọn, chỉ xảy ra bên trong ca sử dụng chính. Hai ca sử dụng thuộc phần học chính (UC02, UC03) được đặc tả đầy đủ với luồng cơ bản, luồng thay thế và quy tắc; các ca sử dụng còn lại được đặc tả gọn qua mô tả, các chức năng và quy tắc. Những điều kiện sau áp dụng chung cho mọi ca sử dụng, trừ UC01:</w:t>
       </w:r>
     </w:p>
     <w:p>
@@ -2987,7 +2771,7 @@
           <w:sz w:val="26"/>
           <w:szCs w:val="26"/>
         </w:rPr>
-        <w:t xml:space="preserve">Hệ thống không có chức năng tự đăng ký. Tài khoản quản trị viên được khai báo sẵn khi cài đặt hệ thống; mọi tài khoản khác do quản trị viên tạo (UC10).</w:t>
+        <w:t xml:space="preserve">Hệ thống không có chức năng tự đăng ký. Tài khoản quản trị viên được khai báo sẵn khi cài đặt hệ thống; mọi tài khoản khác do quản trị viên tạo (UC08).</w:t>
       </w:r>
     </w:p>
     <w:p>
@@ -3083,7 +2867,7 @@
           <w:sz w:val="26"/>
           <w:szCs w:val="26"/>
         </w:rPr>
-        <w:t xml:space="preserve"> Người học trò chuyện nhiều lượt với AI để tìm hiểu kiến thức. AI trả lời dựa trên cuộc trò chuyện và các nguồn được đính kèm, tự tra cứu tài liệu của người học hoặc tìm kiếm trên web khi cần. Ca sử dụng này bao gồm cả việc hỏi trên một tài liệu đang đọc. Các ca sử dụng con được thể hiện ở Hình 2.5.</w:t>
+        <w:t xml:space="preserve"> Người học trò chuyện nhiều lượt với AI để tìm hiểu kiến thức. AI trả lời dựa trên cuộc trò chuyện và các nguồn được đính kèm, tự tra cứu tài liệu của người học hoặc tìm kiếm trên web khi cần. Các ca sử dụng con được thể hiện ở Hình 2.5.</w:t>
       </w:r>
     </w:p>
     <w:p>
@@ -3095,7 +2879,7 @@
       <w:r>
         <w:drawing>
           <wp:inline distT="0" distB="0" distL="0" distR="0">
-            <wp:extent cx="5334000" cy="2228850"/>
+            <wp:extent cx="5334000" cy="1885950"/>
             <wp:effectExtent t="0" r="0" b="0" l="0"/>
             <wp:docPr id="5" name="Hình 2.5. Biểu đồ ca sử dụng phân rã – Hỏi đáp với AI" descr="Hình 2.5. Biểu đồ ca sử dụng phân rã – Hỏi đáp với AI" title="Hình 2.5. Biểu đồ ca sử dụng phân rã – Hỏi đáp với AI"/>
             <wp:cNvGraphicFramePr>
@@ -3120,7 +2904,7 @@
                   <pic:spPr bwMode="auto">
                     <a:xfrm>
                       <a:off x="0" y="0"/>
-                      <a:ext cx="5334000" cy="2228850"/>
+                      <a:ext cx="5334000" cy="1885950"/>
                     </a:xfrm>
                     <a:prstGeom prst="rect">
                       <a:avLst/>
@@ -3677,7 +3461,7 @@
           <w:sz w:val="26"/>
           <w:szCs w:val="26"/>
         </w:rPr>
-        <w:t xml:space="preserve"> Trước khi gửi, người học chọn nguồn cho lượt hỏi: tài liệu (kho tài liệu, tệp, tài liệu đang đọc) hoặc kết quả học cũ (cuộc trò chuyện cũ, sổ ghi chép, câu hỏi đã làm). AI dựa vào các nguồn này khi trả lời.</w:t>
+        <w:t xml:space="preserve"> Trước khi gửi, người học chọn nguồn cho lượt hỏi: tài liệu (kho tài liệu, tệp) hoặc kết quả học cũ (cuộc trò chuyện cũ, ghi chép). AI dựa vào các nguồn này khi trả lời.</w:t>
       </w:r>
     </w:p>
     <w:p>
@@ -3729,17 +3513,17 @@
           <w:sz w:val="26"/>
           <w:szCs w:val="26"/>
         </w:rPr>
-        <w:t xml:space="preserve">Hỏi trên tài liệu đang đọc.</w:t>
-      </w:r>
-      <w:r>
-        <w:rPr>
-          <w:rFonts w:ascii="Times New Roman" w:cs="Times New Roman" w:eastAsia="Times New Roman" w:hAnsi="Times New Roman"/>
-          <w:b w:val="false"/>
-          <w:bCs w:val="false"/>
-          <w:sz w:val="26"/>
-          <w:szCs w:val="26"/>
-        </w:rPr>
-        <w:t xml:space="preserve"> Người học mở một tài liệu trong kho tài liệu (UC06) cạnh khung trò chuyện, chọn một đoạn rồi đặt câu hỏi. Câu trả lời chỉ ra vị trí liên quan trong tài liệu; bấm vào thì tài liệu chuyển tới đúng chỗ đó. Lần mở sau, tài liệu mở lại đúng chỗ đang đọc dở.</w:t>
+        <w:t xml:space="preserve">Dừng lượt trả lời.</w:t>
+      </w:r>
+      <w:r>
+        <w:rPr>
+          <w:rFonts w:ascii="Times New Roman" w:cs="Times New Roman" w:eastAsia="Times New Roman" w:hAnsi="Times New Roman"/>
+          <w:b w:val="false"/>
+          <w:bCs w:val="false"/>
+          <w:sz w:val="26"/>
+          <w:szCs w:val="26"/>
+        </w:rPr>
+        <w:t xml:space="preserve"> Trong lúc câu trả lời đang hiện, người học chọn dừng; hệ thống ngừng lượt đó và giữ phần đã hiển thị.</w:t>
       </w:r>
     </w:p>
     <w:p>
@@ -3760,17 +3544,17 @@
           <w:sz w:val="26"/>
           <w:szCs w:val="26"/>
         </w:rPr>
-        <w:t xml:space="preserve">Dừng lượt trả lời.</w:t>
-      </w:r>
-      <w:r>
-        <w:rPr>
-          <w:rFonts w:ascii="Times New Roman" w:cs="Times New Roman" w:eastAsia="Times New Roman" w:hAnsi="Times New Roman"/>
-          <w:b w:val="false"/>
-          <w:bCs w:val="false"/>
-          <w:sz w:val="26"/>
-          <w:szCs w:val="26"/>
-        </w:rPr>
-        <w:t xml:space="preserve"> Trong lúc câu trả lời đang hiện, người học chọn dừng; hệ thống ngừng lượt đó và giữ phần đã hiển thị.</w:t>
+        <w:t xml:space="preserve">Xem lại cuộc trò chuyện.</w:t>
+      </w:r>
+      <w:r>
+        <w:rPr>
+          <w:rFonts w:ascii="Times New Roman" w:cs="Times New Roman" w:eastAsia="Times New Roman" w:hAnsi="Times New Roman"/>
+          <w:b w:val="false"/>
+          <w:bCs w:val="false"/>
+          <w:sz w:val="26"/>
+          <w:szCs w:val="26"/>
+        </w:rPr>
+        <w:t xml:space="preserve"> Người học mở danh sách cuộc trò chuyện của không gian học đang mở để xem lại hoặc hỏi tiếp.</w:t>
       </w:r>
     </w:p>
     <w:p>
@@ -3791,17 +3575,34 @@
           <w:sz w:val="26"/>
           <w:szCs w:val="26"/>
         </w:rPr>
-        <w:t xml:space="preserve">Xem lại cuộc trò chuyện.</w:t>
-      </w:r>
-      <w:r>
-        <w:rPr>
-          <w:rFonts w:ascii="Times New Roman" w:cs="Times New Roman" w:eastAsia="Times New Roman" w:hAnsi="Times New Roman"/>
-          <w:b w:val="false"/>
-          <w:bCs w:val="false"/>
-          <w:sz w:val="26"/>
-          <w:szCs w:val="26"/>
-        </w:rPr>
-        <w:t xml:space="preserve"> Người học mở danh sách cuộc trò chuyện của không gian học đang mở để xem lại hoặc hỏi tiếp.</w:t>
+        <w:t xml:space="preserve">Lưu trữ, khôi phục cuộc trò chuyện.</w:t>
+      </w:r>
+      <w:r>
+        <w:rPr>
+          <w:rFonts w:ascii="Times New Roman" w:cs="Times New Roman" w:eastAsia="Times New Roman" w:hAnsi="Times New Roman"/>
+          <w:b w:val="false"/>
+          <w:bCs w:val="false"/>
+          <w:sz w:val="26"/>
+          <w:szCs w:val="26"/>
+        </w:rPr>
+        <w:t xml:space="preserve"> Từ danh sách, người học lưu trữ cuộc trò chuyện không còn dùng và khôi phục khi cần.</w:t>
+      </w:r>
+    </w:p>
+    <w:p>
+      <w:pPr>
+        <w:keepNext/>
+        <w:spacing w:after="80" w:before="120" w:line="340"/>
+        <w:jc w:val="both"/>
+      </w:pPr>
+      <w:r>
+        <w:rPr>
+          <w:rFonts w:ascii="Times New Roman" w:cs="Times New Roman" w:eastAsia="Times New Roman" w:hAnsi="Times New Roman"/>
+          <w:b/>
+          <w:bCs/>
+          <w:sz w:val="26"/>
+          <w:szCs w:val="26"/>
+        </w:rPr>
+        <w:t xml:space="preserve">Luồng ngoại lệ:</w:t>
       </w:r>
     </w:p>
     <w:p>
@@ -3822,34 +3623,17 @@
           <w:sz w:val="26"/>
           <w:szCs w:val="26"/>
         </w:rPr>
-        <w:t xml:space="preserve">Lưu trữ, khôi phục cuộc trò chuyện.</w:t>
-      </w:r>
-      <w:r>
-        <w:rPr>
-          <w:rFonts w:ascii="Times New Roman" w:cs="Times New Roman" w:eastAsia="Times New Roman" w:hAnsi="Times New Roman"/>
-          <w:b w:val="false"/>
-          <w:bCs w:val="false"/>
-          <w:sz w:val="26"/>
-          <w:szCs w:val="26"/>
-        </w:rPr>
-        <w:t xml:space="preserve"> Từ danh sách, người học lưu trữ cuộc trò chuyện không còn dùng và khôi phục khi cần.</w:t>
-      </w:r>
-    </w:p>
-    <w:p>
-      <w:pPr>
-        <w:keepNext/>
-        <w:spacing w:after="80" w:before="120" w:line="340"/>
-        <w:jc w:val="both"/>
-      </w:pPr>
-      <w:r>
-        <w:rPr>
-          <w:rFonts w:ascii="Times New Roman" w:cs="Times New Roman" w:eastAsia="Times New Roman" w:hAnsi="Times New Roman"/>
-          <w:b/>
-          <w:bCs/>
-          <w:sz w:val="26"/>
-          <w:szCs w:val="26"/>
-        </w:rPr>
-        <w:t xml:space="preserve">Luồng ngoại lệ:</w:t>
+        <w:t xml:space="preserve">Tải lại trang giữa chừng.</w:t>
+      </w:r>
+      <w:r>
+        <w:rPr>
+          <w:rFonts w:ascii="Times New Roman" w:cs="Times New Roman" w:eastAsia="Times New Roman" w:hAnsi="Times New Roman"/>
+          <w:b w:val="false"/>
+          <w:bCs w:val="false"/>
+          <w:sz w:val="26"/>
+          <w:szCs w:val="26"/>
+        </w:rPr>
+        <w:t xml:space="preserve"> Hệ thống hiển thị lại phần câu trả lời đã có và tiếp tục hiển thị phần còn lại.</w:t>
       </w:r>
     </w:p>
     <w:p>
@@ -3870,17 +3654,34 @@
           <w:sz w:val="26"/>
           <w:szCs w:val="26"/>
         </w:rPr>
-        <w:t xml:space="preserve">Tải lại trang giữa chừng.</w:t>
-      </w:r>
-      <w:r>
-        <w:rPr>
-          <w:rFonts w:ascii="Times New Roman" w:cs="Times New Roman" w:eastAsia="Times New Roman" w:hAnsi="Times New Roman"/>
-          <w:b w:val="false"/>
-          <w:bCs w:val="false"/>
-          <w:sz w:val="26"/>
-          <w:szCs w:val="26"/>
-        </w:rPr>
-        <w:t xml:space="preserve"> Hệ thống hiển thị lại phần câu trả lời đã có và tiếp tục hiển thị phần còn lại.</w:t>
+        <w:t xml:space="preserve">Không tra cứu được nguồn.</w:t>
+      </w:r>
+      <w:r>
+        <w:rPr>
+          <w:rFonts w:ascii="Times New Roman" w:cs="Times New Roman" w:eastAsia="Times New Roman" w:hAnsi="Times New Roman"/>
+          <w:b w:val="false"/>
+          <w:bCs w:val="false"/>
+          <w:sz w:val="26"/>
+          <w:szCs w:val="26"/>
+        </w:rPr>
+        <w:t xml:space="preserve"> AI vẫn trả lời bằng thông tin đang có; lượt trả lời không bị hủy.</w:t>
+      </w:r>
+    </w:p>
+    <w:p>
+      <w:pPr>
+        <w:keepNext/>
+        <w:spacing w:after="80" w:before="120" w:line="340"/>
+        <w:jc w:val="both"/>
+      </w:pPr>
+      <w:r>
+        <w:rPr>
+          <w:rFonts w:ascii="Times New Roman" w:cs="Times New Roman" w:eastAsia="Times New Roman" w:hAnsi="Times New Roman"/>
+          <w:b/>
+          <w:bCs/>
+          <w:sz w:val="26"/>
+          <w:szCs w:val="26"/>
+        </w:rPr>
+        <w:t xml:space="preserve">Quy tắc:</w:t>
       </w:r>
     </w:p>
     <w:p>
@@ -3896,39 +3697,12 @@
       <w:r>
         <w:rPr>
           <w:rFonts w:ascii="Times New Roman" w:cs="Times New Roman" w:eastAsia="Times New Roman" w:hAnsi="Times New Roman"/>
-          <w:b/>
-          <w:bCs/>
-          <w:sz w:val="26"/>
-          <w:szCs w:val="26"/>
-        </w:rPr>
-        <w:t xml:space="preserve">Không tra cứu được nguồn.</w:t>
-      </w:r>
-      <w:r>
-        <w:rPr>
-          <w:rFonts w:ascii="Times New Roman" w:cs="Times New Roman" w:eastAsia="Times New Roman" w:hAnsi="Times New Roman"/>
-          <w:b w:val="false"/>
-          <w:bCs w:val="false"/>
-          <w:sz w:val="26"/>
-          <w:szCs w:val="26"/>
-        </w:rPr>
-        <w:t xml:space="preserve"> AI vẫn trả lời bằng thông tin đang có; lượt trả lời không bị hủy.</w:t>
-      </w:r>
-    </w:p>
-    <w:p>
-      <w:pPr>
-        <w:keepNext/>
-        <w:spacing w:after="80" w:before="120" w:line="340"/>
-        <w:jc w:val="both"/>
-      </w:pPr>
-      <w:r>
-        <w:rPr>
-          <w:rFonts w:ascii="Times New Roman" w:cs="Times New Roman" w:eastAsia="Times New Roman" w:hAnsi="Times New Roman"/>
-          <w:b/>
-          <w:bCs/>
-          <w:sz w:val="26"/>
-          <w:szCs w:val="26"/>
-        </w:rPr>
-        <w:t xml:space="preserve">Quy tắc:</w:t>
+          <w:b w:val="false"/>
+          <w:bCs w:val="false"/>
+          <w:sz w:val="26"/>
+          <w:szCs w:val="26"/>
+        </w:rPr>
+        <w:t xml:space="preserve">Câu trả lời phải hiển thị dần, không chờ sinh xong toàn bộ.</w:t>
       </w:r>
     </w:p>
     <w:p>
@@ -3949,28 +3723,7 @@
           <w:sz w:val="26"/>
           <w:szCs w:val="26"/>
         </w:rPr>
-        <w:t xml:space="preserve">Câu trả lời phải hiển thị dần, không chờ sinh xong toàn bộ.</w:t>
-      </w:r>
-    </w:p>
-    <w:p>
-      <w:pPr>
-        <w:pStyle w:val="ListParagraph"/>
-        <w:numPr>
-          <w:ilvl w:val="0"/>
-          <w:numId w:val="2"/>
-        </w:numPr>
-        <w:spacing w:after="80" w:before="0" w:line="340"/>
-        <w:jc w:val="both"/>
-      </w:pPr>
-      <w:r>
-        <w:rPr>
-          <w:rFonts w:ascii="Times New Roman" w:cs="Times New Roman" w:eastAsia="Times New Roman" w:hAnsi="Times New Roman"/>
-          <w:b w:val="false"/>
-          <w:bCs w:val="false"/>
-          <w:sz w:val="26"/>
-          <w:szCs w:val="26"/>
-        </w:rPr>
-        <w:t xml:space="preserve">AI dùng bộ nhớ về người học (UC08) để điều chỉnh câu trả lời cho phù hợp.</w:t>
+        <w:t xml:space="preserve">AI dùng bộ nhớ về người học (UC06) để điều chỉnh câu trả lời cho phù hợp.</w:t>
       </w:r>
     </w:p>
     <w:p>
@@ -4283,7 +4036,7 @@
                 <w:sz w:val="24"/>
                 <w:szCs w:val="24"/>
               </w:rPr>
-              <w:t xml:space="preserve">1. Mở danh sách lộ trình, chọn tạo lộ trình mới, nhập mục tiêu học và chọn tài liệu làm nguồn nếu muốn (kho tài liệu, sổ ghi chép, cuộc trò chuyện cũ, câu hỏi đã làm).</w:t>
+              <w:t xml:space="preserve">1. Mở danh sách lộ trình, chọn tạo lộ trình mới, nhập mục tiêu học và chọn tài liệu làm nguồn nếu muốn (kho tài liệu, ghi chép, cuộc trò chuyện cũ).</w:t>
             </w:r>
           </w:p>
         </w:tc>
@@ -5478,7 +5231,7 @@
           <w:sz w:val="26"/>
           <w:szCs w:val="26"/>
         </w:rPr>
-        <w:t xml:space="preserve">Chỉ câu trả lời của người học trong lộ trình mới làm thay đổi mức nắm vững; việc AI giảng giải, trả lời câu hỏi hay vẽ sơ đồ không làm thay đổi.</w:t>
+        <w:t xml:space="preserve">Chỉ câu trả lời của người học trong lộ trình mới làm thay đổi mức nắm vững; việc AI giảng giải (kể cả sơ đồ minh họa trong lời giảng) hay trả lời câu hỏi không làm thay đổi.</w:t>
       </w:r>
     </w:p>
     <w:p>
@@ -5562,7 +5315,7 @@
           <w:sz w:val="26"/>
           <w:szCs w:val="26"/>
         </w:rPr>
-        <w:t xml:space="preserve">UC04: Làm quiz luyện tập</w:t>
+        <w:t xml:space="preserve">UC04: Quản lý tài liệu học</w:t>
       </w:r>
     </w:p>
     <w:p>
@@ -5616,7 +5369,7 @@
           <w:sz w:val="26"/>
           <w:szCs w:val="26"/>
         </w:rPr>
-        <w:t xml:space="preserve"> Người học yêu cầu hệ thống sinh một bộ câu hỏi về một chủ đề để tự kiểm tra. Câu trả lời được chấm và kèm giải thích; câu hỏi và kết quả được lưu vào ngân hàng câu hỏi để xem lại. Các ca sử dụng con được thể hiện ở Hình 2.8.</w:t>
+        <w:t xml:space="preserve"> Người học tạo các kho tài liệu và tải tài liệu của mình lên, để AI tra cứu và dẫn nguồn khi trả lời ở các ca sử dụng khác. Các ca sử dụng con được thể hiện ở Hình 2.8.</w:t>
       </w:r>
     </w:p>
     <w:p>
@@ -5628,9 +5381,9 @@
       <w:r>
         <w:drawing>
           <wp:inline distT="0" distB="0" distL="0" distR="0">
-            <wp:extent cx="5334000" cy="1952625"/>
+            <wp:extent cx="5334000" cy="2752725"/>
             <wp:effectExtent t="0" r="0" b="0" l="0"/>
-            <wp:docPr id="8" name="Hình 2.8. Biểu đồ ca sử dụng phân rã – Làm quiz luyện tập" descr="Hình 2.8. Biểu đồ ca sử dụng phân rã – Làm quiz luyện tập" title="Hình 2.8. Biểu đồ ca sử dụng phân rã – Làm quiz luyện tập"/>
+            <wp:docPr id="8" name="Hình 2.8. Biểu đồ ca sử dụng phân rã – Quản lý tài liệu học" descr="Hình 2.8. Biểu đồ ca sử dụng phân rã – Quản lý tài liệu học" title="Hình 2.8. Biểu đồ ca sử dụng phân rã – Quản lý tài liệu học"/>
             <wp:cNvGraphicFramePr>
               <a:graphicFrameLocks xmlns:a="http://schemas.openxmlformats.org/drawingml/2006/main" noChangeAspect="1"/>
             </wp:cNvGraphicFramePr>
@@ -5653,7 +5406,7 @@
                   <pic:spPr bwMode="auto">
                     <a:xfrm>
                       <a:off x="0" y="0"/>
-                      <a:ext cx="5334000" cy="1952625"/>
+                      <a:ext cx="5334000" cy="2752725"/>
                     </a:xfrm>
                     <a:prstGeom prst="rect">
                       <a:avLst/>
@@ -5680,436 +5433,8 @@
           <w:sz w:val="24"/>
           <w:szCs w:val="24"/>
         </w:rPr>
-        <w:t xml:space="preserve">Hình 2.8. Biểu đồ ca sử dụng phân rã – Làm quiz luyện tập</w:t>
-      </w:r>
-    </w:p>
-    <w:p>
-      <w:pPr>
-        <w:keepNext w:val="false"/>
-        <w:spacing w:after="80" w:before="120" w:line="340"/>
-        <w:jc w:val="both"/>
-      </w:pPr>
-      <w:r>
-        <w:rPr>
-          <w:rFonts w:ascii="Times New Roman" w:cs="Times New Roman" w:eastAsia="Times New Roman" w:hAnsi="Times New Roman"/>
-          <w:b/>
-          <w:bCs/>
-          <w:sz w:val="26"/>
-          <w:szCs w:val="26"/>
-        </w:rPr>
-        <w:t xml:space="preserve">Hậu điều kiện:</w:t>
-      </w:r>
-      <w:r>
-        <w:rPr>
-          <w:rFonts w:ascii="Times New Roman" w:cs="Times New Roman" w:eastAsia="Times New Roman" w:hAnsi="Times New Roman"/>
-          <w:b w:val="false"/>
-          <w:bCs w:val="false"/>
-          <w:sz w:val="26"/>
-          <w:szCs w:val="26"/>
-        </w:rPr>
-        <w:t xml:space="preserve"> Bộ câu hỏi, câu trả lời của người học và kết quả chấm được lưu vào ngân hàng câu hỏi.</w:t>
-      </w:r>
-    </w:p>
-    <w:p>
-      <w:pPr>
-        <w:keepNext/>
-        <w:spacing w:after="100" w:before="160"/>
-        <w:jc w:val="center"/>
-      </w:pPr>
-      <w:r>
-        <w:rPr>
-          <w:rFonts w:ascii="Times New Roman" w:cs="Times New Roman" w:eastAsia="Times New Roman" w:hAnsi="Times New Roman"/>
-          <w:b/>
-          <w:bCs/>
-          <w:sz w:val="24"/>
-          <w:szCs w:val="24"/>
-        </w:rPr>
-        <w:t xml:space="preserve">Bảng 2.6. Luồng cơ bản – Tạo và làm bộ câu hỏi</w:t>
-      </w:r>
-    </w:p>
-    <w:tbl>
-      <w:tblPr>
-        <w:tblW w:type="dxa" w:w="9071"/>
-        <w:tblBorders>
-          <w:top w:val="single" w:color="auto" w:sz="4"/>
-          <w:left w:val="single" w:color="auto" w:sz="4"/>
-          <w:bottom w:val="single" w:color="auto" w:sz="4"/>
-          <w:right w:val="single" w:color="auto" w:sz="4"/>
-          <w:insideH w:val="single" w:color="auto" w:sz="4"/>
-          <w:insideV w:val="single" w:color="auto" w:sz="4"/>
-        </w:tblBorders>
-      </w:tblPr>
-      <w:tblGrid>
-        <w:gridCol w:w="3810"/>
-        <w:gridCol w:w="5261"/>
-      </w:tblGrid>
-      <w:tr>
-        <w:trPr>
-          <w:cantSplit/>
-          <w:tblHeader/>
-        </w:trPr>
-        <w:tc>
-          <w:tcPr>
-            <w:tcW w:type="dxa" w:w="3810"/>
-            <w:tcBorders>
-              <w:top w:val="single" w:color="000000" w:sz="4"/>
-              <w:left w:val="single" w:color="000000" w:sz="4"/>
-              <w:bottom w:val="single" w:color="000000" w:sz="4"/>
-              <w:right w:val="single" w:color="000000" w:sz="4"/>
-            </w:tcBorders>
-            <w:shd w:fill="E7EAF0" w:color="auto" w:val="clear"/>
-            <w:tcMar>
-              <w:top w:type="dxa" w:w="60"/>
-              <w:left w:type="dxa" w:w="100"/>
-              <w:bottom w:type="dxa" w:w="60"/>
-              <w:right w:type="dxa" w:w="100"/>
-            </w:tcMar>
-            <w:vAlign w:val="center"/>
-          </w:tcPr>
-          <w:p>
-            <w:pPr>
-              <w:spacing w:after="0" w:before="0" w:line="276"/>
-              <w:jc w:val="center"/>
-            </w:pPr>
-            <w:r>
-              <w:rPr>
-                <w:rFonts w:ascii="Times New Roman" w:cs="Times New Roman" w:eastAsia="Times New Roman" w:hAnsi="Times New Roman"/>
-                <w:b/>
-                <w:bCs/>
-                <w:sz w:val="24"/>
-                <w:szCs w:val="24"/>
-              </w:rPr>
-              <w:t xml:space="preserve">Hành động của người học</w:t>
-            </w:r>
-          </w:p>
-        </w:tc>
-        <w:tc>
-          <w:tcPr>
-            <w:tcW w:type="dxa" w:w="5261"/>
-            <w:tcBorders>
-              <w:top w:val="single" w:color="000000" w:sz="4"/>
-              <w:left w:val="single" w:color="000000" w:sz="4"/>
-              <w:bottom w:val="single" w:color="000000" w:sz="4"/>
-              <w:right w:val="single" w:color="000000" w:sz="4"/>
-            </w:tcBorders>
-            <w:shd w:fill="E7EAF0" w:color="auto" w:val="clear"/>
-            <w:tcMar>
-              <w:top w:type="dxa" w:w="60"/>
-              <w:left w:type="dxa" w:w="100"/>
-              <w:bottom w:type="dxa" w:w="60"/>
-              <w:right w:type="dxa" w:w="100"/>
-            </w:tcMar>
-            <w:vAlign w:val="center"/>
-          </w:tcPr>
-          <w:p>
-            <w:pPr>
-              <w:spacing w:after="0" w:before="0" w:line="276"/>
-              <w:jc w:val="center"/>
-            </w:pPr>
-            <w:r>
-              <w:rPr>
-                <w:rFonts w:ascii="Times New Roman" w:cs="Times New Roman" w:eastAsia="Times New Roman" w:hAnsi="Times New Roman"/>
-                <w:b/>
-                <w:bCs/>
-                <w:sz w:val="24"/>
-                <w:szCs w:val="24"/>
-              </w:rPr>
-              <w:t xml:space="preserve">Phản ứng của hệ thống</w:t>
-            </w:r>
-          </w:p>
-        </w:tc>
-      </w:tr>
-      <w:tr>
-        <w:trPr>
-          <w:cantSplit/>
-          <w:tblHeader w:val="off"/>
-        </w:trPr>
-        <w:tc>
-          <w:tcPr>
-            <w:tcW w:type="dxa" w:w="3810"/>
-            <w:tcBorders>
-              <w:top w:val="single" w:color="000000" w:sz="4"/>
-              <w:left w:val="single" w:color="000000" w:sz="4"/>
-              <w:bottom w:val="single" w:color="000000" w:sz="4"/>
-              <w:right w:val="single" w:color="000000" w:sz="4"/>
-            </w:tcBorders>
-            <w:tcMar>
-              <w:top w:type="dxa" w:w="60"/>
-              <w:left w:type="dxa" w:w="100"/>
-              <w:bottom w:type="dxa" w:w="60"/>
-              <w:right w:type="dxa" w:w="100"/>
-            </w:tcMar>
-            <w:vAlign w:val="top"/>
-          </w:tcPr>
-          <w:p>
-            <w:pPr>
-              <w:spacing w:after="0" w:before="0" w:line="276"/>
-              <w:jc w:val="left"/>
-            </w:pPr>
-            <w:r>
-              <w:rPr>
-                <w:rFonts w:ascii="Times New Roman" w:cs="Times New Roman" w:eastAsia="Times New Roman" w:hAnsi="Times New Roman"/>
-                <w:b w:val="false"/>
-                <w:bCs w:val="false"/>
-                <w:sz w:val="24"/>
-                <w:szCs w:val="24"/>
-              </w:rPr>
-              <w:t xml:space="preserve">1. Chọn chế độ quiz, nhập chủ đề, chọn số câu, độ khó và các loại câu hỏi, rồi gửi.</w:t>
-            </w:r>
-          </w:p>
-        </w:tc>
-        <w:tc>
-          <w:tcPr>
-            <w:tcW w:type="dxa" w:w="5261"/>
-            <w:tcBorders>
-              <w:top w:val="single" w:color="000000" w:sz="4"/>
-              <w:left w:val="single" w:color="000000" w:sz="4"/>
-              <w:bottom w:val="single" w:color="000000" w:sz="4"/>
-              <w:right w:val="single" w:color="000000" w:sz="4"/>
-            </w:tcBorders>
-            <w:tcMar>
-              <w:top w:type="dxa" w:w="60"/>
-              <w:left w:type="dxa" w:w="100"/>
-              <w:bottom w:type="dxa" w:w="60"/>
-              <w:right w:type="dxa" w:w="100"/>
-            </w:tcMar>
-            <w:vAlign w:val="top"/>
-          </w:tcPr>
-          <w:p>
-            <w:pPr>
-              <w:spacing w:after="0" w:before="0" w:line="276"/>
-              <w:jc w:val="left"/>
-            </w:pPr>
-            <w:r>
-              <w:rPr>
-                <w:rFonts w:ascii="Times New Roman" w:cs="Times New Roman" w:eastAsia="Times New Roman" w:hAnsi="Times New Roman"/>
-                <w:b w:val="false"/>
-                <w:bCs w:val="false"/>
-                <w:sz w:val="24"/>
-                <w:szCs w:val="24"/>
-              </w:rPr>
-              <w:t xml:space="preserve">2. Sinh bộ câu hỏi theo chủ đề và lựa chọn của người học, dựa trên các nguồn được đính kèm hoặc tìm kiếm web khi cần; hiển thị dần từng câu, mỗi câu kèm đáp án tham khảo và lời giải thích.</w:t>
-            </w:r>
-          </w:p>
-        </w:tc>
-      </w:tr>
-      <w:tr>
-        <w:trPr>
-          <w:cantSplit/>
-          <w:tblHeader w:val="off"/>
-        </w:trPr>
-        <w:tc>
-          <w:tcPr>
-            <w:tcW w:type="dxa" w:w="3810"/>
-            <w:tcBorders>
-              <w:top w:val="single" w:color="000000" w:sz="4"/>
-              <w:left w:val="single" w:color="000000" w:sz="4"/>
-              <w:bottom w:val="single" w:color="000000" w:sz="4"/>
-              <w:right w:val="single" w:color="000000" w:sz="4"/>
-            </w:tcBorders>
-            <w:tcMar>
-              <w:top w:type="dxa" w:w="60"/>
-              <w:left w:type="dxa" w:w="100"/>
-              <w:bottom w:type="dxa" w:w="60"/>
-              <w:right w:type="dxa" w:w="100"/>
-            </w:tcMar>
-            <w:vAlign w:val="top"/>
-          </w:tcPr>
-          <w:p>
-            <w:pPr>
-              <w:spacing w:after="0" w:before="0" w:line="276"/>
-              <w:jc w:val="left"/>
-            </w:pPr>
-            <w:r>
-              <w:rPr>
-                <w:rFonts w:ascii="Times New Roman" w:cs="Times New Roman" w:eastAsia="Times New Roman" w:hAnsi="Times New Roman"/>
-                <w:b w:val="false"/>
-                <w:bCs w:val="false"/>
-                <w:sz w:val="24"/>
-                <w:szCs w:val="24"/>
-              </w:rPr>
-              <w:t xml:space="preserve">3. Trả lời một câu và chọn kiểm tra.</w:t>
-            </w:r>
-          </w:p>
-        </w:tc>
-        <w:tc>
-          <w:tcPr>
-            <w:tcW w:type="dxa" w:w="5261"/>
-            <w:tcBorders>
-              <w:top w:val="single" w:color="000000" w:sz="4"/>
-              <w:left w:val="single" w:color="000000" w:sz="4"/>
-              <w:bottom w:val="single" w:color="000000" w:sz="4"/>
-              <w:right w:val="single" w:color="000000" w:sz="4"/>
-            </w:tcBorders>
-            <w:tcMar>
-              <w:top w:type="dxa" w:w="60"/>
-              <w:left w:type="dxa" w:w="100"/>
-              <w:bottom w:type="dxa" w:w="60"/>
-              <w:right w:type="dxa" w:w="100"/>
-            </w:tcMar>
-            <w:vAlign w:val="top"/>
-          </w:tcPr>
-          <w:p>
-            <w:pPr>
-              <w:spacing w:after="0" w:before="0" w:line="276"/>
-              <w:jc w:val="left"/>
-            </w:pPr>
-            <w:r>
-              <w:rPr>
-                <w:rFonts w:ascii="Times New Roman" w:cs="Times New Roman" w:eastAsia="Times New Roman" w:hAnsi="Times New Roman"/>
-                <w:b w:val="false"/>
-                <w:bCs w:val="false"/>
-                <w:sz w:val="24"/>
-                <w:szCs w:val="24"/>
-              </w:rPr>
-              <w:t xml:space="preserve">4. Chấm câu trả lời: câu có đáp án xác định được so với đáp án; câu trả lời mở được AI đánh giá là đúng, đúng một phần hoặc sai, kèm nhận xét chỗ đúng, chỗ thiếu.</w:t>
-            </w:r>
-          </w:p>
-        </w:tc>
-      </w:tr>
-      <w:tr>
-        <w:trPr>
-          <w:cantSplit/>
-          <w:tblHeader w:val="off"/>
-        </w:trPr>
-        <w:tc>
-          <w:tcPr>
-            <w:tcW w:type="dxa" w:w="3810"/>
-            <w:tcBorders>
-              <w:top w:val="single" w:color="000000" w:sz="4"/>
-              <w:left w:val="single" w:color="000000" w:sz="4"/>
-              <w:bottom w:val="single" w:color="000000" w:sz="4"/>
-              <w:right w:val="single" w:color="000000" w:sz="4"/>
-            </w:tcBorders>
-            <w:tcMar>
-              <w:top w:type="dxa" w:w="60"/>
-              <w:left w:type="dxa" w:w="100"/>
-              <w:bottom w:type="dxa" w:w="60"/>
-              <w:right w:type="dxa" w:w="100"/>
-            </w:tcMar>
-            <w:vAlign w:val="top"/>
-          </w:tcPr>
-          <w:p>
-            <w:pPr>
-              <w:spacing w:after="0" w:before="0" w:line="276"/>
-              <w:jc w:val="left"/>
-            </w:pPr>
-          </w:p>
-        </w:tc>
-        <w:tc>
-          <w:tcPr>
-            <w:tcW w:type="dxa" w:w="5261"/>
-            <w:tcBorders>
-              <w:top w:val="single" w:color="000000" w:sz="4"/>
-              <w:left w:val="single" w:color="000000" w:sz="4"/>
-              <w:bottom w:val="single" w:color="000000" w:sz="4"/>
-              <w:right w:val="single" w:color="000000" w:sz="4"/>
-            </w:tcBorders>
-            <w:tcMar>
-              <w:top w:type="dxa" w:w="60"/>
-              <w:left w:type="dxa" w:w="100"/>
-              <w:bottom w:type="dxa" w:w="60"/>
-              <w:right w:type="dxa" w:w="100"/>
-            </w:tcMar>
-            <w:vAlign w:val="top"/>
-          </w:tcPr>
-          <w:p>
-            <w:pPr>
-              <w:spacing w:after="0" w:before="0" w:line="276"/>
-              <w:jc w:val="left"/>
-            </w:pPr>
-            <w:r>
-              <w:rPr>
-                <w:rFonts w:ascii="Times New Roman" w:cs="Times New Roman" w:eastAsia="Times New Roman" w:hAnsi="Times New Roman"/>
-                <w:b w:val="false"/>
-                <w:bCs w:val="false"/>
-                <w:sz w:val="24"/>
-                <w:szCs w:val="24"/>
-              </w:rPr>
-              <w:t xml:space="preserve">5. Hiển thị đáp án tham khảo và lời giải thích; lưu câu trả lời và kết quả vào ngân hàng câu hỏi.</w:t>
-            </w:r>
-          </w:p>
-        </w:tc>
-      </w:tr>
-      <w:tr>
-        <w:trPr>
-          <w:cantSplit/>
-          <w:tblHeader w:val="off"/>
-        </w:trPr>
-        <w:tc>
-          <w:tcPr>
-            <w:tcW w:type="dxa" w:w="3810"/>
-            <w:tcBorders>
-              <w:top w:val="single" w:color="000000" w:sz="4"/>
-              <w:left w:val="single" w:color="000000" w:sz="4"/>
-              <w:bottom w:val="single" w:color="000000" w:sz="4"/>
-              <w:right w:val="single" w:color="000000" w:sz="4"/>
-            </w:tcBorders>
-            <w:tcMar>
-              <w:top w:type="dxa" w:w="60"/>
-              <w:left w:type="dxa" w:w="100"/>
-              <w:bottom w:type="dxa" w:w="60"/>
-              <w:right w:type="dxa" w:w="100"/>
-            </w:tcMar>
-            <w:vAlign w:val="top"/>
-          </w:tcPr>
-          <w:p>
-            <w:pPr>
-              <w:spacing w:after="0" w:before="0" w:line="276"/>
-              <w:jc w:val="left"/>
-            </w:pPr>
-            <w:r>
-              <w:rPr>
-                <w:rFonts w:ascii="Times New Roman" w:cs="Times New Roman" w:eastAsia="Times New Roman" w:hAnsi="Times New Roman"/>
-                <w:b w:val="false"/>
-                <w:bCs w:val="false"/>
-                <w:sz w:val="24"/>
-                <w:szCs w:val="24"/>
-              </w:rPr>
-              <w:t xml:space="preserve">6. Chuyển sang câu tiếp theo.</w:t>
-            </w:r>
-          </w:p>
-        </w:tc>
-        <w:tc>
-          <w:tcPr>
-            <w:tcW w:type="dxa" w:w="5261"/>
-            <w:tcBorders>
-              <w:top w:val="single" w:color="000000" w:sz="4"/>
-              <w:left w:val="single" w:color="000000" w:sz="4"/>
-              <w:bottom w:val="single" w:color="000000" w:sz="4"/>
-              <w:right w:val="single" w:color="000000" w:sz="4"/>
-            </w:tcBorders>
-            <w:tcMar>
-              <w:top w:type="dxa" w:w="60"/>
-              <w:left w:type="dxa" w:w="100"/>
-              <w:bottom w:type="dxa" w:w="60"/>
-              <w:right w:type="dxa" w:w="100"/>
-            </w:tcMar>
-            <w:vAlign w:val="top"/>
-          </w:tcPr>
-          <w:p>
-            <w:pPr>
-              <w:spacing w:after="0" w:before="0" w:line="276"/>
-              <w:jc w:val="left"/>
-            </w:pPr>
-            <w:r>
-              <w:rPr>
-                <w:rFonts w:ascii="Times New Roman" w:cs="Times New Roman" w:eastAsia="Times New Roman" w:hAnsi="Times New Roman"/>
-                <w:b w:val="false"/>
-                <w:bCs w:val="false"/>
-                <w:sz w:val="24"/>
-                <w:szCs w:val="24"/>
-              </w:rPr>
-              <w:t xml:space="preserve">7. Lặp lại từ bước 4 cho tới hết bộ câu hỏi.</w:t>
-            </w:r>
-          </w:p>
-        </w:tc>
-      </w:tr>
-    </w:tbl>
-    <w:p>
-      <w:pPr>
-        <w:spacing w:after="160" w:before="0"/>
-      </w:pPr>
+        <w:t xml:space="preserve">Hình 2.8. Biểu đồ ca sử dụng phân rã – Quản lý tài liệu học</w:t>
+      </w:r>
     </w:p>
     <w:p>
       <w:pPr>
@@ -6125,7 +5450,7 @@
           <w:sz w:val="26"/>
           <w:szCs w:val="26"/>
         </w:rPr>
-        <w:t xml:space="preserve">Luồng thay thế:</w:t>
+        <w:t xml:space="preserve">Chức năng:</w:t>
       </w:r>
     </w:p>
     <w:p>
@@ -6146,17 +5471,17 @@
           <w:sz w:val="26"/>
           <w:szCs w:val="26"/>
         </w:rPr>
-        <w:t xml:space="preserve">Sinh câu hỏi từ tài liệu.</w:t>
-      </w:r>
-      <w:r>
-        <w:rPr>
-          <w:rFonts w:ascii="Times New Roman" w:cs="Times New Roman" w:eastAsia="Times New Roman" w:hAnsi="Times New Roman"/>
-          <w:b w:val="false"/>
-          <w:bCs w:val="false"/>
-          <w:sz w:val="26"/>
-          <w:szCs w:val="26"/>
-        </w:rPr>
-        <w:t xml:space="preserve"> Người học đính kèm kho tài liệu, tệp hoặc sổ ghi chép; câu hỏi được sinh chủ yếu từ các nguồn này.</w:t>
+        <w:t xml:space="preserve">Tạo kho tài liệu.</w:t>
+      </w:r>
+      <w:r>
+        <w:rPr>
+          <w:rFonts w:ascii="Times New Roman" w:cs="Times New Roman" w:eastAsia="Times New Roman" w:hAnsi="Times New Roman"/>
+          <w:b w:val="false"/>
+          <w:bCs w:val="false"/>
+          <w:sz w:val="26"/>
+          <w:szCs w:val="26"/>
+        </w:rPr>
+        <w:t xml:space="preserve"> Người học đặt tên kho và chọn các tài liệu ban đầu.</w:t>
       </w:r>
     </w:p>
     <w:p>
@@ -6177,17 +5502,17 @@
           <w:sz w:val="26"/>
           <w:szCs w:val="26"/>
         </w:rPr>
-        <w:t xml:space="preserve">Trả lời bằng hình ảnh.</w:t>
-      </w:r>
-      <w:r>
-        <w:rPr>
-          <w:rFonts w:ascii="Times New Roman" w:cs="Times New Roman" w:eastAsia="Times New Roman" w:hAnsi="Times New Roman"/>
-          <w:b w:val="false"/>
-          <w:bCs w:val="false"/>
-          <w:sz w:val="26"/>
-          <w:szCs w:val="26"/>
-        </w:rPr>
-        <w:t xml:space="preserve"> Với câu tự luận, người học gửi ảnh chụp bài làm thay cho văn bản.</w:t>
+        <w:t xml:space="preserve">Thêm tài liệu vào kho.</w:t>
+      </w:r>
+      <w:r>
+        <w:rPr>
+          <w:rFonts w:ascii="Times New Roman" w:cs="Times New Roman" w:eastAsia="Times New Roman" w:hAnsi="Times New Roman"/>
+          <w:b w:val="false"/>
+          <w:bCs w:val="false"/>
+          <w:sz w:val="26"/>
+          <w:szCs w:val="26"/>
+        </w:rPr>
+        <w:t xml:space="preserve"> Tải thêm tài liệu vào một kho đã có.</w:t>
       </w:r>
     </w:p>
     <w:p>
@@ -6208,17 +5533,17 @@
           <w:sz w:val="26"/>
           <w:szCs w:val="26"/>
         </w:rPr>
-        <w:t xml:space="preserve">Hỏi tiếp về một câu.</w:t>
-      </w:r>
-      <w:r>
-        <w:rPr>
-          <w:rFonts w:ascii="Times New Roman" w:cs="Times New Roman" w:eastAsia="Times New Roman" w:hAnsi="Times New Roman"/>
-          <w:b w:val="false"/>
-          <w:bCs w:val="false"/>
-          <w:sz w:val="26"/>
-          <w:szCs w:val="26"/>
-        </w:rPr>
-        <w:t xml:space="preserve"> Người học mở cuộc trò chuyện tiếp nối cho một câu hỏi để hỏi thêm về cách giải.</w:t>
+        <w:t xml:space="preserve">Tải lên và xử lý tài liệu.</w:t>
+      </w:r>
+      <w:r>
+        <w:rPr>
+          <w:rFonts w:ascii="Times New Roman" w:cs="Times New Roman" w:eastAsia="Times New Roman" w:hAnsi="Times New Roman"/>
+          <w:b w:val="false"/>
+          <w:bCs w:val="false"/>
+          <w:sz w:val="26"/>
+          <w:szCs w:val="26"/>
+        </w:rPr>
+        <w:t xml:space="preserve"> Được thực hiện mỗi khi tạo kho hoặc thêm tài liệu: hệ thống nhận tệp, xử lý để tra cứu và hiển thị tiến độ cho tới khi tài liệu sẵn sàng.</w:t>
       </w:r>
     </w:p>
     <w:p>
@@ -6239,17 +5564,17 @@
           <w:sz w:val="26"/>
           <w:szCs w:val="26"/>
         </w:rPr>
-        <w:t xml:space="preserve">Xem lại ngân hàng câu hỏi.</w:t>
-      </w:r>
-      <w:r>
-        <w:rPr>
-          <w:rFonts w:ascii="Times New Roman" w:cs="Times New Roman" w:eastAsia="Times New Roman" w:hAnsi="Times New Roman"/>
-          <w:b w:val="false"/>
-          <w:bCs w:val="false"/>
-          <w:sz w:val="26"/>
-          <w:szCs w:val="26"/>
-        </w:rPr>
-        <w:t xml:space="preserve"> Người học tìm kiếm, lọc, sắp xếp câu hỏi đã làm và mở lại cuộc trò chuyện gốc.</w:t>
+        <w:t xml:space="preserve">Sắp xếp tài liệu theo thư mục.</w:t>
+      </w:r>
+      <w:r>
+        <w:rPr>
+          <w:rFonts w:ascii="Times New Roman" w:cs="Times New Roman" w:eastAsia="Times New Roman" w:hAnsi="Times New Roman"/>
+          <w:b w:val="false"/>
+          <w:bCs w:val="false"/>
+          <w:sz w:val="26"/>
+          <w:szCs w:val="26"/>
+        </w:rPr>
+        <w:t xml:space="preserve"> Tạo thư mục và chuyển tài liệu giữa các thư mục.</w:t>
       </w:r>
     </w:p>
     <w:p>
@@ -6270,17 +5595,17 @@
           <w:sz w:val="26"/>
           <w:szCs w:val="26"/>
         </w:rPr>
-        <w:t xml:space="preserve">Quản lý câu hỏi đã làm.</w:t>
-      </w:r>
-      <w:r>
-        <w:rPr>
-          <w:rFonts w:ascii="Times New Roman" w:cs="Times New Roman" w:eastAsia="Times New Roman" w:hAnsi="Times New Roman"/>
-          <w:b w:val="false"/>
-          <w:bCs w:val="false"/>
-          <w:sz w:val="26"/>
-          <w:szCs w:val="26"/>
-        </w:rPr>
-        <w:t xml:space="preserve"> Từ ngân hàng câu hỏi, người học đánh dấu, gắn nhãn, đánh dấu đã nắm hoặc cần ôn lại, hoặc xóa câu hỏi.</w:t>
+        <w:t xml:space="preserve">Xem trước tài liệu.</w:t>
+      </w:r>
+      <w:r>
+        <w:rPr>
+          <w:rFonts w:ascii="Times New Roman" w:cs="Times New Roman" w:eastAsia="Times New Roman" w:hAnsi="Times New Roman"/>
+          <w:b w:val="false"/>
+          <w:bCs w:val="false"/>
+          <w:sz w:val="26"/>
+          <w:szCs w:val="26"/>
+        </w:rPr>
+        <w:t xml:space="preserve"> Xem danh sách tài liệu trong kho và xem trước nội dung một tài liệu.</w:t>
       </w:r>
     </w:p>
     <w:p>
@@ -6301,34 +5626,7 @@
           <w:sz w:val="26"/>
           <w:szCs w:val="26"/>
         </w:rPr>
-        <w:t xml:space="preserve">Dùng lại câu hỏi cũ.</w:t>
-      </w:r>
-      <w:r>
-        <w:rPr>
-          <w:rFonts w:ascii="Times New Roman" w:cs="Times New Roman" w:eastAsia="Times New Roman" w:hAnsi="Times New Roman"/>
-          <w:b w:val="false"/>
-          <w:bCs w:val="false"/>
-          <w:sz w:val="26"/>
-          <w:szCs w:val="26"/>
-        </w:rPr>
-        <w:t xml:space="preserve"> Người học đính kèm câu hỏi trong ngân hàng làm nguồn cho một lượt hỏi mới (UC02).</w:t>
-      </w:r>
-    </w:p>
-    <w:p>
-      <w:pPr>
-        <w:keepNext/>
-        <w:spacing w:after="80" w:before="120" w:line="340"/>
-        <w:jc w:val="both"/>
-      </w:pPr>
-      <w:r>
-        <w:rPr>
-          <w:rFonts w:ascii="Times New Roman" w:cs="Times New Roman" w:eastAsia="Times New Roman" w:hAnsi="Times New Roman"/>
-          <w:b/>
-          <w:bCs/>
-          <w:sz w:val="26"/>
-          <w:szCs w:val="26"/>
-        </w:rPr>
-        <w:t xml:space="preserve">Quy tắc:</w:t>
+        <w:t xml:space="preserve">Xóa tài liệu hoặc kho.</w:t>
       </w:r>
     </w:p>
     <w:p>
@@ -6344,12 +5642,39 @@
       <w:r>
         <w:rPr>
           <w:rFonts w:ascii="Times New Roman" w:cs="Times New Roman" w:eastAsia="Times New Roman" w:hAnsi="Times New Roman"/>
-          <w:b w:val="false"/>
-          <w:bCs w:val="false"/>
-          <w:sz w:val="26"/>
-          <w:szCs w:val="26"/>
-        </w:rPr>
-        <w:t xml:space="preserve">Hệ thống hỗ trợ sáu loại câu hỏi: trắc nghiệm, đúng sai, điền vào chỗ trống, trả lời ngắn, tự luận và lập trình.</w:t>
+          <w:b/>
+          <w:bCs/>
+          <w:sz w:val="26"/>
+          <w:szCs w:val="26"/>
+        </w:rPr>
+        <w:t xml:space="preserve">Chọn kho mặc định</w:t>
+      </w:r>
+      <w:r>
+        <w:rPr>
+          <w:rFonts w:ascii="Times New Roman" w:cs="Times New Roman" w:eastAsia="Times New Roman" w:hAnsi="Times New Roman"/>
+          <w:b w:val="false"/>
+          <w:bCs w:val="false"/>
+          <w:sz w:val="26"/>
+          <w:szCs w:val="26"/>
+        </w:rPr>
+        <w:t xml:space="preserve"> để AI tra cứu.</w:t>
+      </w:r>
+    </w:p>
+    <w:p>
+      <w:pPr>
+        <w:keepNext/>
+        <w:spacing w:after="80" w:before="120" w:line="340"/>
+        <w:jc w:val="both"/>
+      </w:pPr>
+      <w:r>
+        <w:rPr>
+          <w:rFonts w:ascii="Times New Roman" w:cs="Times New Roman" w:eastAsia="Times New Roman" w:hAnsi="Times New Roman"/>
+          <w:b/>
+          <w:bCs/>
+          <w:sz w:val="26"/>
+          <w:szCs w:val="26"/>
+        </w:rPr>
+        <w:t xml:space="preserve">Quy tắc:</w:t>
       </w:r>
     </w:p>
     <w:p>
@@ -6370,7 +5695,28 @@
           <w:sz w:val="26"/>
           <w:szCs w:val="26"/>
         </w:rPr>
-        <w:t xml:space="preserve">Kết quả làm quiz không làm thay đổi mức nắm vững của lộ trình học (UC03).</w:t>
+        <w:t xml:space="preserve">Chỉ nhận tài liệu dạng PDF, Word (.docx), PowerPoint (.pptx), văn bản và Markdown; tệp sai định dạng hoặc quá lớn bị từ chối kèm thông báo, các tệp hợp lệ vẫn được xử lý.</w:t>
+      </w:r>
+    </w:p>
+    <w:p>
+      <w:pPr>
+        <w:pStyle w:val="ListParagraph"/>
+        <w:numPr>
+          <w:ilvl w:val="0"/>
+          <w:numId w:val="2"/>
+        </w:numPr>
+        <w:spacing w:after="80" w:before="0" w:line="340"/>
+        <w:jc w:val="both"/>
+      </w:pPr>
+      <w:r>
+        <w:rPr>
+          <w:rFonts w:ascii="Times New Roman" w:cs="Times New Roman" w:eastAsia="Times New Roman" w:hAnsi="Times New Roman"/>
+          <w:b w:val="false"/>
+          <w:bCs w:val="false"/>
+          <w:sz w:val="26"/>
+          <w:szCs w:val="26"/>
+        </w:rPr>
+        <w:t xml:space="preserve">Tài liệu xử lý thất bại được đánh dấu lỗi và cho phép thử lại.</w:t>
       </w:r>
     </w:p>
     <w:p>
@@ -6391,7 +5737,7 @@
           <w:sz w:val="26"/>
           <w:szCs w:val="26"/>
         </w:rPr>
-        <w:t xml:space="preserve">UC05: Vẽ sơ đồ minh họa</w:t>
+        <w:t xml:space="preserve">UC05: Ghi chép</w:t>
       </w:r>
     </w:p>
     <w:p>
@@ -6445,7 +5791,7 @@
           <w:sz w:val="26"/>
           <w:szCs w:val="26"/>
         </w:rPr>
-        <w:t xml:space="preserve"> Người học mô tả một nội dung cần minh họa và nhận lại một sơ đồ hiển thị ngay trong cuộc trò chuyện. Các ca sử dụng con được thể hiện ở Hình 2.9.</w:t>
+        <w:t xml:space="preserve"> Người học ghi chép trong quá trình học; AI ghi chép giúp và chỉnh sửa ghi chép theo yêu cầu của người học. Các ghi chép tạo thành sổ ghi chép của người học để xem lại và dùng lại làm nguồn. Các ca sử dụng con được thể hiện ở Hình 2.9.</w:t>
       </w:r>
     </w:p>
     <w:p>
@@ -6457,9 +5803,9 @@
       <w:r>
         <w:drawing>
           <wp:inline distT="0" distB="0" distL="0" distR="0">
-            <wp:extent cx="5334000" cy="1304925"/>
+            <wp:extent cx="5334000" cy="1971675"/>
             <wp:effectExtent t="0" r="0" b="0" l="0"/>
-            <wp:docPr id="9" name="Hình 2.9. Biểu đồ ca sử dụng phân rã – Vẽ sơ đồ minh họa" descr="Hình 2.9. Biểu đồ ca sử dụng phân rã – Vẽ sơ đồ minh họa" title="Hình 2.9. Biểu đồ ca sử dụng phân rã – Vẽ sơ đồ minh họa"/>
+            <wp:docPr id="9" name="Hình 2.9. Biểu đồ ca sử dụng phân rã – Ghi chép" descr="Hình 2.9. Biểu đồ ca sử dụng phân rã – Ghi chép" title="Hình 2.9. Biểu đồ ca sử dụng phân rã – Ghi chép"/>
             <wp:cNvGraphicFramePr>
               <a:graphicFrameLocks xmlns:a="http://schemas.openxmlformats.org/drawingml/2006/main" noChangeAspect="1"/>
             </wp:cNvGraphicFramePr>
@@ -6482,7 +5828,7 @@
                   <pic:spPr bwMode="auto">
                     <a:xfrm>
                       <a:off x="0" y="0"/>
-                      <a:ext cx="5334000" cy="1304925"/>
+                      <a:ext cx="5334000" cy="1971675"/>
                     </a:xfrm>
                     <a:prstGeom prst="rect">
                       <a:avLst/>
@@ -6509,7 +5855,7 @@
           <w:sz w:val="24"/>
           <w:szCs w:val="24"/>
         </w:rPr>
-        <w:t xml:space="preserve">Hình 2.9. Biểu đồ ca sử dụng phân rã – Vẽ sơ đồ minh họa</w:t>
+        <w:t xml:space="preserve">Hình 2.9. Biểu đồ ca sử dụng phân rã – Ghi chép</w:t>
       </w:r>
     </w:p>
     <w:p>
@@ -6547,17 +5893,17 @@
           <w:sz w:val="26"/>
           <w:szCs w:val="26"/>
         </w:rPr>
-        <w:t xml:space="preserve">Vẽ sơ đồ từ mô tả.</w:t>
-      </w:r>
-      <w:r>
-        <w:rPr>
-          <w:rFonts w:ascii="Times New Roman" w:cs="Times New Roman" w:eastAsia="Times New Roman" w:hAnsi="Times New Roman"/>
-          <w:b w:val="false"/>
-          <w:bCs w:val="false"/>
-          <w:sz w:val="26"/>
-          <w:szCs w:val="26"/>
-        </w:rPr>
-        <w:t xml:space="preserve"> Người học chọn chế độ vẽ sơ đồ, mô tả nội dung; hệ thống chọn kiểu sơ đồ phù hợp và hiển thị sơ đồ trong cuộc trò chuyện.</w:t>
+        <w:t xml:space="preserve">Ghi chép trong lúc học.</w:t>
+      </w:r>
+      <w:r>
+        <w:rPr>
+          <w:rFonts w:ascii="Times New Roman" w:cs="Times New Roman" w:eastAsia="Times New Roman" w:hAnsi="Times New Roman"/>
+          <w:b w:val="false"/>
+          <w:bCs w:val="false"/>
+          <w:sz w:val="26"/>
+          <w:szCs w:val="26"/>
+        </w:rPr>
+        <w:t xml:space="preserve"> Người học mở ghi chép ngay cạnh cuộc trò chuyện hoặc buổi học theo lộ trình, tự viết nội dung dạng Markdown và xem trước.</w:t>
       </w:r>
     </w:p>
     <w:p>
@@ -6578,17 +5924,17 @@
           <w:sz w:val="26"/>
           <w:szCs w:val="26"/>
         </w:rPr>
-        <w:t xml:space="preserve">Vẽ từ nội dung có sẵn.</w:t>
-      </w:r>
-      <w:r>
-        <w:rPr>
-          <w:rFonts w:ascii="Times New Roman" w:cs="Times New Roman" w:eastAsia="Times New Roman" w:hAnsi="Times New Roman"/>
-          <w:b w:val="false"/>
-          <w:bCs w:val="false"/>
-          <w:sz w:val="26"/>
-          <w:szCs w:val="26"/>
-        </w:rPr>
-        <w:t xml:space="preserve"> Người học đính kèm một bản ghi trong sổ ghi chép hoặc một tài liệu và yêu cầu vẽ sơ đồ từ nội dung đó.</w:t>
+        <w:t xml:space="preserve">Nhờ AI ghi chép.</w:t>
+      </w:r>
+      <w:r>
+        <w:rPr>
+          <w:rFonts w:ascii="Times New Roman" w:cs="Times New Roman" w:eastAsia="Times New Roman" w:hAnsi="Times New Roman"/>
+          <w:b w:val="false"/>
+          <w:bCs w:val="false"/>
+          <w:sz w:val="26"/>
+          <w:szCs w:val="26"/>
+        </w:rPr>
+        <w:t xml:space="preserve"> Trong cuộc trò chuyện hoặc buổi học, người học bảo AI ghi lại một ý hoặc tóm tắt một phần vào ghi chép; AI viết ngắn gọn bằng lời của mình, không chép nguyên văn cuộc trò chuyện.</w:t>
       </w:r>
     </w:p>
     <w:p>
@@ -6609,34 +5955,17 @@
           <w:sz w:val="26"/>
           <w:szCs w:val="26"/>
         </w:rPr>
-        <w:t xml:space="preserve">Chỉnh sơ đồ.</w:t>
-      </w:r>
-      <w:r>
-        <w:rPr>
-          <w:rFonts w:ascii="Times New Roman" w:cs="Times New Roman" w:eastAsia="Times New Roman" w:hAnsi="Times New Roman"/>
-          <w:b w:val="false"/>
-          <w:bCs w:val="false"/>
-          <w:sz w:val="26"/>
-          <w:szCs w:val="26"/>
-        </w:rPr>
-        <w:t xml:space="preserve"> Người học yêu cầu sửa sơ đồ ở lượt tiếp theo.</w:t>
-      </w:r>
-    </w:p>
-    <w:p>
-      <w:pPr>
-        <w:keepNext/>
-        <w:spacing w:after="80" w:before="120" w:line="340"/>
-        <w:jc w:val="both"/>
-      </w:pPr>
-      <w:r>
-        <w:rPr>
-          <w:rFonts w:ascii="Times New Roman" w:cs="Times New Roman" w:eastAsia="Times New Roman" w:hAnsi="Times New Roman"/>
-          <w:b/>
-          <w:bCs/>
-          <w:sz w:val="26"/>
-          <w:szCs w:val="26"/>
-        </w:rPr>
-        <w:t xml:space="preserve">Quy tắc:</w:t>
+        <w:t xml:space="preserve">Nhờ AI chỉnh sửa ghi chép.</w:t>
+      </w:r>
+      <w:r>
+        <w:rPr>
+          <w:rFonts w:ascii="Times New Roman" w:cs="Times New Roman" w:eastAsia="Times New Roman" w:hAnsi="Times New Roman"/>
+          <w:b w:val="false"/>
+          <w:bCs w:val="false"/>
+          <w:sz w:val="26"/>
+          <w:szCs w:val="26"/>
+        </w:rPr>
+        <w:t xml:space="preserve"> Người học bảo AI bổ sung, sửa hoặc sắp xếp lại ghi chép, hoặc chọn một đoạn và nhờ AI viết lại, rút gọn, mở rộng. AI cũng có thể đánh dấu các ý chính.</w:t>
       </w:r>
     </w:p>
     <w:p>
@@ -6652,12 +5981,22 @@
       <w:r>
         <w:rPr>
           <w:rFonts w:ascii="Times New Roman" w:cs="Times New Roman" w:eastAsia="Times New Roman" w:hAnsi="Times New Roman"/>
-          <w:b w:val="false"/>
-          <w:bCs w:val="false"/>
-          <w:sz w:val="26"/>
-          <w:szCs w:val="26"/>
-        </w:rPr>
-        <w:t xml:space="preserve">Hỗ trợ bốn kiểu sơ đồ: sơ đồ khái niệm, lưu đồ, dòng thời gian và sơ đồ so sánh.</w:t>
+          <w:b/>
+          <w:bCs/>
+          <w:sz w:val="26"/>
+          <w:szCs w:val="26"/>
+        </w:rPr>
+        <w:t xml:space="preserve">Quản lý sổ ghi chép.</w:t>
+      </w:r>
+      <w:r>
+        <w:rPr>
+          <w:rFonts w:ascii="Times New Roman" w:cs="Times New Roman" w:eastAsia="Times New Roman" w:hAnsi="Times New Roman"/>
+          <w:b w:val="false"/>
+          <w:bCs w:val="false"/>
+          <w:sz w:val="26"/>
+          <w:szCs w:val="26"/>
+        </w:rPr>
+        <w:t xml:space="preserve"> Xem danh sách ghi chép, tìm, đổi tên và xóa ghi chép. Từ đây có thể xuất ghi chép ra tệp Markdown.</w:t>
       </w:r>
     </w:p>
     <w:p>
@@ -6673,12 +6012,81 @@
       <w:r>
         <w:rPr>
           <w:rFonts w:ascii="Times New Roman" w:cs="Times New Roman" w:eastAsia="Times New Roman" w:hAnsi="Times New Roman"/>
-          <w:b w:val="false"/>
-          <w:bCs w:val="false"/>
-          <w:sz w:val="26"/>
-          <w:szCs w:val="26"/>
-        </w:rPr>
-        <w:t xml:space="preserve">Hệ thống chỉ hiển thị sơ đồ hợp lệ; không hiển thị sơ đồ bị lỗi cho người học.</w:t>
+          <w:b/>
+          <w:bCs/>
+          <w:sz w:val="26"/>
+          <w:szCs w:val="26"/>
+        </w:rPr>
+        <w:t xml:space="preserve">Dùng lại làm nguồn.</w:t>
+      </w:r>
+      <w:r>
+        <w:rPr>
+          <w:rFonts w:ascii="Times New Roman" w:cs="Times New Roman" w:eastAsia="Times New Roman" w:hAnsi="Times New Roman"/>
+          <w:b w:val="false"/>
+          <w:bCs w:val="false"/>
+          <w:sz w:val="26"/>
+          <w:szCs w:val="26"/>
+        </w:rPr>
+        <w:t xml:space="preserve"> Đính kèm ghi chép vào lượt hỏi (UC02), hoặc chọn làm nguồn khi tạo lộ trình (UC03).</w:t>
+      </w:r>
+    </w:p>
+    <w:p>
+      <w:pPr>
+        <w:keepNext/>
+        <w:spacing w:after="80" w:before="120" w:line="340"/>
+        <w:jc w:val="both"/>
+      </w:pPr>
+      <w:r>
+        <w:rPr>
+          <w:rFonts w:ascii="Times New Roman" w:cs="Times New Roman" w:eastAsia="Times New Roman" w:hAnsi="Times New Roman"/>
+          <w:b/>
+          <w:bCs/>
+          <w:sz w:val="26"/>
+          <w:szCs w:val="26"/>
+        </w:rPr>
+        <w:t xml:space="preserve">Quy tắc:</w:t>
+      </w:r>
+    </w:p>
+    <w:p>
+      <w:pPr>
+        <w:pStyle w:val="ListParagraph"/>
+        <w:numPr>
+          <w:ilvl w:val="0"/>
+          <w:numId w:val="2"/>
+        </w:numPr>
+        <w:spacing w:after="80" w:before="0" w:line="340"/>
+        <w:jc w:val="both"/>
+      </w:pPr>
+      <w:r>
+        <w:rPr>
+          <w:rFonts w:ascii="Times New Roman" w:cs="Times New Roman" w:eastAsia="Times New Roman" w:hAnsi="Times New Roman"/>
+          <w:b w:val="false"/>
+          <w:bCs w:val="false"/>
+          <w:sz w:val="26"/>
+          <w:szCs w:val="26"/>
+        </w:rPr>
+        <w:t xml:space="preserve">AI chỉ ghi hoặc sửa ghi chép khi người học yêu cầu.</w:t>
+      </w:r>
+    </w:p>
+    <w:p>
+      <w:pPr>
+        <w:pStyle w:val="ListParagraph"/>
+        <w:numPr>
+          <w:ilvl w:val="0"/>
+          <w:numId w:val="2"/>
+        </w:numPr>
+        <w:spacing w:after="80" w:before="0" w:line="340"/>
+        <w:jc w:val="both"/>
+      </w:pPr>
+      <w:r>
+        <w:rPr>
+          <w:rFonts w:ascii="Times New Roman" w:cs="Times New Roman" w:eastAsia="Times New Roman" w:hAnsi="Times New Roman"/>
+          <w:b w:val="false"/>
+          <w:bCs w:val="false"/>
+          <w:sz w:val="26"/>
+          <w:szCs w:val="26"/>
+        </w:rPr>
+        <w:t xml:space="preserve">Nội dung ghi chép không bị mất khi rời trang giữa chừng.</w:t>
       </w:r>
     </w:p>
     <w:p>
@@ -6699,7 +6107,7 @@
           <w:sz w:val="26"/>
           <w:szCs w:val="26"/>
         </w:rPr>
-        <w:t xml:space="preserve">UC06: Quản lý tài liệu học</w:t>
+        <w:t xml:space="preserve">UC06: Quản lý bộ nhớ người học</w:t>
       </w:r>
     </w:p>
     <w:p>
@@ -6753,7 +6161,7 @@
           <w:sz w:val="26"/>
           <w:szCs w:val="26"/>
         </w:rPr>
-        <w:t xml:space="preserve"> Người học tạo các kho tài liệu và tải tài liệu của mình lên, để AI tra cứu và dẫn nguồn khi trả lời ở các ca sử dụng khác. Các ca sử dụng con được thể hiện ở Hình 2.10.</w:t>
+        <w:t xml:space="preserve"> Hệ thống tự ghi nhớ thông tin về người học qua các buổi học, như những gì đã học, mục tiêu và cách học ưa thích, để AI điều chỉnh cách hỗ trợ ở những lần sau. Người học kiểm soát được những gì hệ thống ghi nhớ. Các ca sử dụng con được thể hiện ở Hình 2.10.</w:t>
       </w:r>
     </w:p>
     <w:p>
@@ -6765,9 +6173,9 @@
       <w:r>
         <w:drawing>
           <wp:inline distT="0" distB="0" distL="0" distR="0">
-            <wp:extent cx="5334000" cy="2752725"/>
+            <wp:extent cx="5334000" cy="1676400"/>
             <wp:effectExtent t="0" r="0" b="0" l="0"/>
-            <wp:docPr id="10" name="Hình 2.10. Biểu đồ ca sử dụng phân rã – Quản lý tài liệu học" descr="Hình 2.10. Biểu đồ ca sử dụng phân rã – Quản lý tài liệu học" title="Hình 2.10. Biểu đồ ca sử dụng phân rã – Quản lý tài liệu học"/>
+            <wp:docPr id="10" name="Hình 2.10. Biểu đồ ca sử dụng phân rã – Quản lý bộ nhớ người học" descr="Hình 2.10. Biểu đồ ca sử dụng phân rã – Quản lý bộ nhớ người học" title="Hình 2.10. Biểu đồ ca sử dụng phân rã – Quản lý bộ nhớ người học"/>
             <wp:cNvGraphicFramePr>
               <a:graphicFrameLocks xmlns:a="http://schemas.openxmlformats.org/drawingml/2006/main" noChangeAspect="1"/>
             </wp:cNvGraphicFramePr>
@@ -6790,7 +6198,7 @@
                   <pic:spPr bwMode="auto">
                     <a:xfrm>
                       <a:off x="0" y="0"/>
-                      <a:ext cx="5334000" cy="2752725"/>
+                      <a:ext cx="5334000" cy="1676400"/>
                     </a:xfrm>
                     <a:prstGeom prst="rect">
                       <a:avLst/>
@@ -6817,7 +6225,7 @@
           <w:sz w:val="24"/>
           <w:szCs w:val="24"/>
         </w:rPr>
-        <w:t xml:space="preserve">Hình 2.10. Biểu đồ ca sử dụng phân rã – Quản lý tài liệu học</w:t>
+        <w:t xml:space="preserve">Hình 2.10. Biểu đồ ca sử dụng phân rã – Quản lý bộ nhớ người học</w:t>
       </w:r>
     </w:p>
     <w:p>
@@ -6855,17 +6263,17 @@
           <w:sz w:val="26"/>
           <w:szCs w:val="26"/>
         </w:rPr>
-        <w:t xml:space="preserve">Tạo kho tài liệu.</w:t>
-      </w:r>
-      <w:r>
-        <w:rPr>
-          <w:rFonts w:ascii="Times New Roman" w:cs="Times New Roman" w:eastAsia="Times New Roman" w:hAnsi="Times New Roman"/>
-          <w:b w:val="false"/>
-          <w:bCs w:val="false"/>
-          <w:sz w:val="26"/>
-          <w:szCs w:val="26"/>
-        </w:rPr>
-        <w:t xml:space="preserve"> Người học đặt tên kho và chọn các tài liệu ban đầu.</w:t>
+        <w:t xml:space="preserve">Xem bộ nhớ.</w:t>
+      </w:r>
+      <w:r>
+        <w:rPr>
+          <w:rFonts w:ascii="Times New Roman" w:cs="Times New Roman" w:eastAsia="Times New Roman" w:hAnsi="Times New Roman"/>
+          <w:b w:val="false"/>
+          <w:bCs w:val="false"/>
+          <w:sz w:val="26"/>
+          <w:szCs w:val="26"/>
+        </w:rPr>
+        <w:t xml:space="preserve"> Người học xem những gì hệ thống đang ghi nhớ về mình và biết mỗi ghi nhận đến từ hoạt động nào.</w:t>
       </w:r>
     </w:p>
     <w:p>
@@ -6886,17 +6294,17 @@
           <w:sz w:val="26"/>
           <w:szCs w:val="26"/>
         </w:rPr>
-        <w:t xml:space="preserve">Thêm tài liệu vào kho.</w:t>
-      </w:r>
-      <w:r>
-        <w:rPr>
-          <w:rFonts w:ascii="Times New Roman" w:cs="Times New Roman" w:eastAsia="Times New Roman" w:hAnsi="Times New Roman"/>
-          <w:b w:val="false"/>
-          <w:bCs w:val="false"/>
-          <w:sz w:val="26"/>
-          <w:szCs w:val="26"/>
-        </w:rPr>
-        <w:t xml:space="preserve"> Tải thêm tài liệu vào một kho đã có.</w:t>
+        <w:t xml:space="preserve">Sửa, xóa ghi nhận.</w:t>
+      </w:r>
+      <w:r>
+        <w:rPr>
+          <w:rFonts w:ascii="Times New Roman" w:cs="Times New Roman" w:eastAsia="Times New Roman" w:hAnsi="Times New Roman"/>
+          <w:b w:val="false"/>
+          <w:bCs w:val="false"/>
+          <w:sz w:val="26"/>
+          <w:szCs w:val="26"/>
+        </w:rPr>
+        <w:t xml:space="preserve"> Người học sửa hoặc xóa những ghi nhận chưa đúng.</w:t>
       </w:r>
     </w:p>
     <w:p>
@@ -6917,17 +6325,17 @@
           <w:sz w:val="26"/>
           <w:szCs w:val="26"/>
         </w:rPr>
-        <w:t xml:space="preserve">Tải lên và xử lý tài liệu.</w:t>
-      </w:r>
-      <w:r>
-        <w:rPr>
-          <w:rFonts w:ascii="Times New Roman" w:cs="Times New Roman" w:eastAsia="Times New Roman" w:hAnsi="Times New Roman"/>
-          <w:b w:val="false"/>
-          <w:bCs w:val="false"/>
-          <w:sz w:val="26"/>
-          <w:szCs w:val="26"/>
-        </w:rPr>
-        <w:t xml:space="preserve"> Được thực hiện mỗi khi tạo kho hoặc thêm tài liệu: hệ thống nhận tệp, xử lý để tra cứu và hiển thị tiến độ cho tới khi tài liệu sẵn sàng.</w:t>
+        <w:t xml:space="preserve">Yêu cầu AI ghi nhớ hoặc quên.</w:t>
+      </w:r>
+      <w:r>
+        <w:rPr>
+          <w:rFonts w:ascii="Times New Roman" w:cs="Times New Roman" w:eastAsia="Times New Roman" w:hAnsi="Times New Roman"/>
+          <w:b w:val="false"/>
+          <w:bCs w:val="false"/>
+          <w:sz w:val="26"/>
+          <w:szCs w:val="26"/>
+        </w:rPr>
+        <w:t xml:space="preserve"> Trong cuộc trò chuyện, người học bảo AI ghi nhớ một mong muốn, ví dụ "hãy giải thích bằng ví dụ", hoặc quên một điều đã ghi nhớ.</w:t>
       </w:r>
     </w:p>
     <w:p>
@@ -6948,17 +6356,34 @@
           <w:sz w:val="26"/>
           <w:szCs w:val="26"/>
         </w:rPr>
-        <w:t xml:space="preserve">Sắp xếp tài liệu theo thư mục.</w:t>
-      </w:r>
-      <w:r>
-        <w:rPr>
-          <w:rFonts w:ascii="Times New Roman" w:cs="Times New Roman" w:eastAsia="Times New Roman" w:hAnsi="Times New Roman"/>
-          <w:b w:val="false"/>
-          <w:bCs w:val="false"/>
-          <w:sz w:val="26"/>
-          <w:szCs w:val="26"/>
-        </w:rPr>
-        <w:t xml:space="preserve"> Tạo thư mục và chuyển tài liệu giữa các thư mục.</w:t>
+        <w:t xml:space="preserve">Bật, tắt bộ nhớ.</w:t>
+      </w:r>
+      <w:r>
+        <w:rPr>
+          <w:rFonts w:ascii="Times New Roman" w:cs="Times New Roman" w:eastAsia="Times New Roman" w:hAnsi="Times New Roman"/>
+          <w:b w:val="false"/>
+          <w:bCs w:val="false"/>
+          <w:sz w:val="26"/>
+          <w:szCs w:val="26"/>
+        </w:rPr>
+        <w:t xml:space="preserve"> Khi bộ nhớ tắt, hệ thống không ghi nhớ thêm và AI không dùng bộ nhớ khi trả lời.</w:t>
+      </w:r>
+    </w:p>
+    <w:p>
+      <w:pPr>
+        <w:keepNext/>
+        <w:spacing w:after="80" w:before="120" w:line="340"/>
+        <w:jc w:val="both"/>
+      </w:pPr>
+      <w:r>
+        <w:rPr>
+          <w:rFonts w:ascii="Times New Roman" w:cs="Times New Roman" w:eastAsia="Times New Roman" w:hAnsi="Times New Roman"/>
+          <w:b/>
+          <w:bCs/>
+          <w:sz w:val="26"/>
+          <w:szCs w:val="26"/>
+        </w:rPr>
+        <w:t xml:space="preserve">Quy tắc:</w:t>
       </w:r>
     </w:p>
     <w:p>
@@ -6974,22 +6399,12 @@
       <w:r>
         <w:rPr>
           <w:rFonts w:ascii="Times New Roman" w:cs="Times New Roman" w:eastAsia="Times New Roman" w:hAnsi="Times New Roman"/>
-          <w:b/>
-          <w:bCs/>
-          <w:sz w:val="26"/>
-          <w:szCs w:val="26"/>
-        </w:rPr>
-        <w:t xml:space="preserve">Xem trước tài liệu.</w:t>
-      </w:r>
-      <w:r>
-        <w:rPr>
-          <w:rFonts w:ascii="Times New Roman" w:cs="Times New Roman" w:eastAsia="Times New Roman" w:hAnsi="Times New Roman"/>
-          <w:b w:val="false"/>
-          <w:bCs w:val="false"/>
-          <w:sz w:val="26"/>
-          <w:szCs w:val="26"/>
-        </w:rPr>
-        <w:t xml:space="preserve"> Xem danh sách tài liệu trong kho và xem trước nội dung một tài liệu.</w:t>
+          <w:b w:val="false"/>
+          <w:bCs w:val="false"/>
+          <w:sz w:val="26"/>
+          <w:szCs w:val="26"/>
+        </w:rPr>
+        <w:t xml:space="preserve">Hệ thống tự cập nhật bộ nhớ sau các buổi học; người học không phải thao tác.</w:t>
       </w:r>
     </w:p>
     <w:p>
@@ -7005,12 +6420,12 @@
       <w:r>
         <w:rPr>
           <w:rFonts w:ascii="Times New Roman" w:cs="Times New Roman" w:eastAsia="Times New Roman" w:hAnsi="Times New Roman"/>
-          <w:b/>
-          <w:bCs/>
-          <w:sz w:val="26"/>
-          <w:szCs w:val="26"/>
-        </w:rPr>
-        <w:t xml:space="preserve">Xóa tài liệu hoặc kho.</w:t>
+          <w:b w:val="false"/>
+          <w:bCs w:val="false"/>
+          <w:sz w:val="26"/>
+          <w:szCs w:val="26"/>
+        </w:rPr>
+        <w:t xml:space="preserve">Khi bộ nhớ đang bật, AI luôn dùng những thông tin chính về người học khi trả lời.</w:t>
       </w:r>
     </w:p>
     <w:p>
@@ -7026,39 +6441,12 @@
       <w:r>
         <w:rPr>
           <w:rFonts w:ascii="Times New Roman" w:cs="Times New Roman" w:eastAsia="Times New Roman" w:hAnsi="Times New Roman"/>
-          <w:b/>
-          <w:bCs/>
-          <w:sz w:val="26"/>
-          <w:szCs w:val="26"/>
-        </w:rPr>
-        <w:t xml:space="preserve">Chọn kho mặc định</w:t>
-      </w:r>
-      <w:r>
-        <w:rPr>
-          <w:rFonts w:ascii="Times New Roman" w:cs="Times New Roman" w:eastAsia="Times New Roman" w:hAnsi="Times New Roman"/>
-          <w:b w:val="false"/>
-          <w:bCs w:val="false"/>
-          <w:sz w:val="26"/>
-          <w:szCs w:val="26"/>
-        </w:rPr>
-        <w:t xml:space="preserve"> để AI tra cứu.</w:t>
-      </w:r>
-    </w:p>
-    <w:p>
-      <w:pPr>
-        <w:keepNext/>
-        <w:spacing w:after="80" w:before="120" w:line="340"/>
-        <w:jc w:val="both"/>
-      </w:pPr>
-      <w:r>
-        <w:rPr>
-          <w:rFonts w:ascii="Times New Roman" w:cs="Times New Roman" w:eastAsia="Times New Roman" w:hAnsi="Times New Roman"/>
-          <w:b/>
-          <w:bCs/>
-          <w:sz w:val="26"/>
-          <w:szCs w:val="26"/>
-        </w:rPr>
-        <w:t xml:space="preserve">Quy tắc:</w:t>
+          <w:b w:val="false"/>
+          <w:bCs w:val="false"/>
+          <w:sz w:val="26"/>
+          <w:szCs w:val="26"/>
+        </w:rPr>
+        <w:t xml:space="preserve">Bộ nhớ dùng chung cho mọi không gian học của người học.</w:t>
       </w:r>
     </w:p>
     <w:p>
@@ -7079,49 +6467,7 @@
           <w:sz w:val="26"/>
           <w:szCs w:val="26"/>
         </w:rPr>
-        <w:t xml:space="preserve">Chỉ nhận tài liệu dạng PDF, văn bản và Markdown; tệp sai định dạng hoặc quá lớn bị từ chối kèm thông báo, các tệp hợp lệ vẫn được xử lý.</w:t>
-      </w:r>
-    </w:p>
-    <w:p>
-      <w:pPr>
-        <w:pStyle w:val="ListParagraph"/>
-        <w:numPr>
-          <w:ilvl w:val="0"/>
-          <w:numId w:val="2"/>
-        </w:numPr>
-        <w:spacing w:after="80" w:before="0" w:line="340"/>
-        <w:jc w:val="both"/>
-      </w:pPr>
-      <w:r>
-        <w:rPr>
-          <w:rFonts w:ascii="Times New Roman" w:cs="Times New Roman" w:eastAsia="Times New Roman" w:hAnsi="Times New Roman"/>
-          <w:b w:val="false"/>
-          <w:bCs w:val="false"/>
-          <w:sz w:val="26"/>
-          <w:szCs w:val="26"/>
-        </w:rPr>
-        <w:t xml:space="preserve">Tài liệu xử lý thất bại được đánh dấu lỗi và cho phép thử lại.</w:t>
-      </w:r>
-    </w:p>
-    <w:p>
-      <w:pPr>
-        <w:pStyle w:val="ListParagraph"/>
-        <w:numPr>
-          <w:ilvl w:val="0"/>
-          <w:numId w:val="2"/>
-        </w:numPr>
-        <w:spacing w:after="80" w:before="0" w:line="340"/>
-        <w:jc w:val="both"/>
-      </w:pPr>
-      <w:r>
-        <w:rPr>
-          <w:rFonts w:ascii="Times New Roman" w:cs="Times New Roman" w:eastAsia="Times New Roman" w:hAnsi="Times New Roman"/>
-          <w:b w:val="false"/>
-          <w:bCs w:val="false"/>
-          <w:sz w:val="26"/>
-          <w:szCs w:val="26"/>
-        </w:rPr>
-        <w:t xml:space="preserve">Tài liệu trong kho cũng là tài liệu để đọc cùng AI (UC02); xóa một tài liệu thì dữ liệu đọc của tài liệu đó cũng bị xóa.</w:t>
+        <w:t xml:space="preserve">Thông tin người học khai khi lập dàn ý một lộ trình (kiến thức đã có, mức độ muốn đạt, thời gian) thuộc về lộ trình đó (UC03).</w:t>
       </w:r>
     </w:p>
     <w:p>
@@ -7142,7 +6488,7 @@
           <w:sz w:val="26"/>
           <w:szCs w:val="26"/>
         </w:rPr>
-        <w:t xml:space="preserve">UC07: Ghi chép</w:t>
+        <w:t xml:space="preserve">UC07: Quản lý không gian học</w:t>
       </w:r>
     </w:p>
     <w:p>
@@ -7196,7 +6542,7 @@
           <w:sz w:val="26"/>
           <w:szCs w:val="26"/>
         </w:rPr>
-        <w:t xml:space="preserve"> Người học lưu những kết quả đáng giữ vào sổ ghi chép để xem lại và dùng lại làm nguồn, và tự soạn tài liệu học với sự hỗ trợ của AI. Các ca sử dụng con được thể hiện ở Hình 2.11.</w:t>
+        <w:t xml:space="preserve"> Người học tạo các không gian học, ví dụ mỗi môn học một không gian, để cuộc trò chuyện, lộ trình, tài liệu và ghi chép của cùng một chủ đề nằm cùng nhau. Các ca sử dụng con được thể hiện ở Hình 2.11.</w:t>
       </w:r>
     </w:p>
     <w:p>
@@ -7208,9 +6554,9 @@
       <w:r>
         <w:drawing>
           <wp:inline distT="0" distB="0" distL="0" distR="0">
-            <wp:extent cx="5334000" cy="2143125"/>
+            <wp:extent cx="5334000" cy="2076450"/>
             <wp:effectExtent t="0" r="0" b="0" l="0"/>
-            <wp:docPr id="11" name="Hình 2.11. Biểu đồ ca sử dụng phân rã – Ghi chép" descr="Hình 2.11. Biểu đồ ca sử dụng phân rã – Ghi chép" title="Hình 2.11. Biểu đồ ca sử dụng phân rã – Ghi chép"/>
+            <wp:docPr id="11" name="Hình 2.11. Biểu đồ ca sử dụng phân rã – Quản lý không gian học" descr="Hình 2.11. Biểu đồ ca sử dụng phân rã – Quản lý không gian học" title="Hình 2.11. Biểu đồ ca sử dụng phân rã – Quản lý không gian học"/>
             <wp:cNvGraphicFramePr>
               <a:graphicFrameLocks xmlns:a="http://schemas.openxmlformats.org/drawingml/2006/main" noChangeAspect="1"/>
             </wp:cNvGraphicFramePr>
@@ -7233,7 +6579,7 @@
                   <pic:spPr bwMode="auto">
                     <a:xfrm>
                       <a:off x="0" y="0"/>
-                      <a:ext cx="5334000" cy="2143125"/>
+                      <a:ext cx="5334000" cy="2076450"/>
                     </a:xfrm>
                     <a:prstGeom prst="rect">
                       <a:avLst/>
@@ -7260,7 +6606,7 @@
           <w:sz w:val="24"/>
           <w:szCs w:val="24"/>
         </w:rPr>
-        <w:t xml:space="preserve">Hình 2.11. Biểu đồ ca sử dụng phân rã – Ghi chép</w:t>
+        <w:t xml:space="preserve">Hình 2.11. Biểu đồ ca sử dụng phân rã – Quản lý không gian học</w:t>
       </w:r>
     </w:p>
     <w:p>
@@ -7298,17 +6644,17 @@
           <w:sz w:val="26"/>
           <w:szCs w:val="26"/>
         </w:rPr>
-        <w:t xml:space="preserve">Lưu vào sổ ghi chép.</w:t>
-      </w:r>
-      <w:r>
-        <w:rPr>
-          <w:rFonts w:ascii="Times New Roman" w:cs="Times New Roman" w:eastAsia="Times New Roman" w:hAnsi="Times New Roman"/>
-          <w:b w:val="false"/>
-          <w:bCs w:val="false"/>
-          <w:sz w:val="26"/>
-          <w:szCs w:val="26"/>
-        </w:rPr>
-        <w:t xml:space="preserve"> Từ cuộc trò chuyện, buổi học theo lộ trình hoặc khung đọc tài liệu, người học chọn các tin nhắn cần lưu, chọn sổ (hoặc tạo sổ mới) và đặt tiêu đề; hệ thống tự viết tóm tắt cho bản ghi. Người học cũng có thể nhờ AI lưu bằng lời, ví dụ "tóm tắt rồi lưu vào sổ".</w:t>
+        <w:t xml:space="preserve">Tạo không gian học</w:t>
+      </w:r>
+      <w:r>
+        <w:rPr>
+          <w:rFonts w:ascii="Times New Roman" w:cs="Times New Roman" w:eastAsia="Times New Roman" w:hAnsi="Times New Roman"/>
+          <w:b w:val="false"/>
+          <w:bCs w:val="false"/>
+          <w:sz w:val="26"/>
+          <w:szCs w:val="26"/>
+        </w:rPr>
+        <w:t xml:space="preserve"> bằng một tên, ví dụ "Xác suất thống kê"; hệ thống chuyển người học vào không gian vừa tạo.</w:t>
       </w:r>
     </w:p>
     <w:p>
@@ -7329,17 +6675,17 @@
           <w:sz w:val="26"/>
           <w:szCs w:val="26"/>
         </w:rPr>
-        <w:t xml:space="preserve">Quản lý sổ và bản ghi.</w:t>
-      </w:r>
-      <w:r>
-        <w:rPr>
-          <w:rFonts w:ascii="Times New Roman" w:cs="Times New Roman" w:eastAsia="Times New Roman" w:hAnsi="Times New Roman"/>
-          <w:b w:val="false"/>
-          <w:bCs w:val="false"/>
-          <w:sz w:val="26"/>
-          <w:szCs w:val="26"/>
-        </w:rPr>
-        <w:t xml:space="preserve"> Tạo, sửa, xóa sổ; tìm bản ghi; sửa, sao chép, chuyển hoặc xóa bản ghi; mở lại cuộc trò chuyện gốc. Từ đây có thể xuất sổ ra tệp Markdown.</w:t>
+        <w:t xml:space="preserve">Chuyển không gian học</w:t>
+      </w:r>
+      <w:r>
+        <w:rPr>
+          <w:rFonts w:ascii="Times New Roman" w:cs="Times New Roman" w:eastAsia="Times New Roman" w:hAnsi="Times New Roman"/>
+          <w:b w:val="false"/>
+          <w:bCs w:val="false"/>
+          <w:sz w:val="26"/>
+          <w:szCs w:val="26"/>
+        </w:rPr>
+        <w:t xml:space="preserve"> để xem và làm việc với nội dung của không gian khác.</w:t>
       </w:r>
     </w:p>
     <w:p>
@@ -7360,17 +6706,34 @@
           <w:sz w:val="26"/>
           <w:szCs w:val="26"/>
         </w:rPr>
-        <w:t xml:space="preserve">Soạn tài liệu.</w:t>
-      </w:r>
-      <w:r>
-        <w:rPr>
-          <w:rFonts w:ascii="Times New Roman" w:cs="Times New Roman" w:eastAsia="Times New Roman" w:hAnsi="Times New Roman"/>
-          <w:b w:val="false"/>
-          <w:bCs w:val="false"/>
-          <w:sz w:val="26"/>
-          <w:szCs w:val="26"/>
-        </w:rPr>
-        <w:t xml:space="preserve"> Tạo tài liệu mới, soạn nội dung Markdown và xem trước.</w:t>
+        <w:t xml:space="preserve">Xem danh sách không gian học</w:t>
+      </w:r>
+      <w:r>
+        <w:rPr>
+          <w:rFonts w:ascii="Times New Roman" w:cs="Times New Roman" w:eastAsia="Times New Roman" w:hAnsi="Times New Roman"/>
+          <w:b w:val="false"/>
+          <w:bCs w:val="false"/>
+          <w:sz w:val="26"/>
+          <w:szCs w:val="26"/>
+        </w:rPr>
+        <w:t xml:space="preserve"> trên trang quản lý không gian học. Từ đây người học đổi tên một không gian; lưu trữ và khôi phục một không gian, nội dung của không gian được lưu trữ vẫn giữ nguyên; hoặc tạo cuộc trò chuyện mới gắn với một không gian đã chọn.</w:t>
+      </w:r>
+    </w:p>
+    <w:p>
+      <w:pPr>
+        <w:keepNext/>
+        <w:spacing w:after="80" w:before="120" w:line="340"/>
+        <w:jc w:val="both"/>
+      </w:pPr>
+      <w:r>
+        <w:rPr>
+          <w:rFonts w:ascii="Times New Roman" w:cs="Times New Roman" w:eastAsia="Times New Roman" w:hAnsi="Times New Roman"/>
+          <w:b/>
+          <w:bCs/>
+          <w:sz w:val="26"/>
+          <w:szCs w:val="26"/>
+        </w:rPr>
+        <w:t xml:space="preserve">Quy tắc:</w:t>
       </w:r>
     </w:p>
     <w:p>
@@ -7386,22 +6749,12 @@
       <w:r>
         <w:rPr>
           <w:rFonts w:ascii="Times New Roman" w:cs="Times New Roman" w:eastAsia="Times New Roman" w:hAnsi="Times New Roman"/>
-          <w:b/>
-          <w:bCs/>
-          <w:sz w:val="26"/>
-          <w:szCs w:val="26"/>
-        </w:rPr>
-        <w:t xml:space="preserve">Ghi chú trong cuộc trò chuyện.</w:t>
-      </w:r>
-      <w:r>
-        <w:rPr>
-          <w:rFonts w:ascii="Times New Roman" w:cs="Times New Roman" w:eastAsia="Times New Roman" w:hAnsi="Times New Roman"/>
-          <w:b w:val="false"/>
-          <w:bCs w:val="false"/>
-          <w:sz w:val="26"/>
-          <w:szCs w:val="26"/>
-        </w:rPr>
-        <w:t xml:space="preserve"> Viết ghi chú ngay trong một cuộc trò chuyện; ghi chú mở lại được trong trình soạn thảo.</w:t>
+          <w:b w:val="false"/>
+          <w:bCs w:val="false"/>
+          <w:sz w:val="26"/>
+          <w:szCs w:val="26"/>
+        </w:rPr>
+        <w:t xml:space="preserve">Nội dung được tạo ở không gian nào thì thuộc không gian đó; khi không chọn, nội dung thuộc không gian mặc định.</w:t>
       </w:r>
     </w:p>
     <w:p>
@@ -7417,22 +6770,12 @@
       <w:r>
         <w:rPr>
           <w:rFonts w:ascii="Times New Roman" w:cs="Times New Roman" w:eastAsia="Times New Roman" w:hAnsi="Times New Roman"/>
-          <w:b/>
-          <w:bCs/>
-          <w:sz w:val="26"/>
-          <w:szCs w:val="26"/>
-        </w:rPr>
-        <w:t xml:space="preserve">Nhờ AI hỗ trợ soạn thảo.</w:t>
-      </w:r>
-      <w:r>
-        <w:rPr>
-          <w:rFonts w:ascii="Times New Roman" w:cs="Times New Roman" w:eastAsia="Times New Roman" w:hAnsi="Times New Roman"/>
-          <w:b w:val="false"/>
-          <w:bCs w:val="false"/>
-          <w:sz w:val="26"/>
-          <w:szCs w:val="26"/>
-        </w:rPr>
-        <w:t xml:space="preserve"> Trong lúc soạn, chọn một đoạn và nhờ AI viết lại, rút gọn, mở rộng hoặc sửa theo mô tả, có thể dựa vào kho tài liệu hoặc web; người học xem đề xuất rồi áp dụng hoặc bỏ qua. AI cũng có thể tự đánh dấu các ý chính.</w:t>
+          <w:b w:val="false"/>
+          <w:bCs w:val="false"/>
+          <w:sz w:val="26"/>
+          <w:szCs w:val="26"/>
+        </w:rPr>
+        <w:t xml:space="preserve">Một cuộc trò chuyện đã có tin nhắn thì không đổi sang không gian khác.</w:t>
       </w:r>
     </w:p>
     <w:p>
@@ -7448,22 +6791,12 @@
       <w:r>
         <w:rPr>
           <w:rFonts w:ascii="Times New Roman" w:cs="Times New Roman" w:eastAsia="Times New Roman" w:hAnsi="Times New Roman"/>
-          <w:b/>
-          <w:bCs/>
-          <w:sz w:val="26"/>
-          <w:szCs w:val="26"/>
-        </w:rPr>
-        <w:t xml:space="preserve">Lưu tài liệu vào sổ, xuất Markdown.</w:t>
-      </w:r>
-      <w:r>
-        <w:rPr>
-          <w:rFonts w:ascii="Times New Roman" w:cs="Times New Roman" w:eastAsia="Times New Roman" w:hAnsi="Times New Roman"/>
-          <w:b w:val="false"/>
-          <w:bCs w:val="false"/>
-          <w:sz w:val="26"/>
-          <w:szCs w:val="26"/>
-        </w:rPr>
-        <w:t xml:space="preserve"> Lưu tài liệu đang soạn vào sổ ghi chép hoặc xuất ra tệp Markdown.</w:t>
+          <w:b w:val="false"/>
+          <w:bCs w:val="false"/>
+          <w:sz w:val="26"/>
+          <w:szCs w:val="26"/>
+        </w:rPr>
+        <w:t xml:space="preserve">Các trang xem lại (sổ ghi chép, lịch sử trò chuyện) luôn cho biết đang hiển thị nội dung của không gian nào.</w:t>
       </w:r>
     </w:p>
     <w:p>
@@ -7479,60 +6812,12 @@
       <w:r>
         <w:rPr>
           <w:rFonts w:ascii="Times New Roman" w:cs="Times New Roman" w:eastAsia="Times New Roman" w:hAnsi="Times New Roman"/>
-          <w:b/>
-          <w:bCs/>
-          <w:sz w:val="26"/>
-          <w:szCs w:val="26"/>
-        </w:rPr>
-        <w:t xml:space="preserve">Dùng lại làm nguồn.</w:t>
-      </w:r>
-      <w:r>
-        <w:rPr>
-          <w:rFonts w:ascii="Times New Roman" w:cs="Times New Roman" w:eastAsia="Times New Roman" w:hAnsi="Times New Roman"/>
-          <w:b w:val="false"/>
-          <w:bCs w:val="false"/>
-          <w:sz w:val="26"/>
-          <w:szCs w:val="26"/>
-        </w:rPr>
-        <w:t xml:space="preserve"> Đính kèm sổ hoặc bản ghi vào lượt hỏi (UC02), hoặc chọn làm nguồn khi tạo lộ trình (UC03).</w:t>
-      </w:r>
-    </w:p>
-    <w:p>
-      <w:pPr>
-        <w:keepNext/>
-        <w:spacing w:after="80" w:before="120" w:line="340"/>
-        <w:jc w:val="both"/>
-      </w:pPr>
-      <w:r>
-        <w:rPr>
-          <w:rFonts w:ascii="Times New Roman" w:cs="Times New Roman" w:eastAsia="Times New Roman" w:hAnsi="Times New Roman"/>
-          <w:b/>
-          <w:bCs/>
-          <w:sz w:val="26"/>
-          <w:szCs w:val="26"/>
-        </w:rPr>
-        <w:t xml:space="preserve">Quy tắc:</w:t>
-      </w:r>
-    </w:p>
-    <w:p>
-      <w:pPr>
-        <w:pStyle w:val="ListParagraph"/>
-        <w:numPr>
-          <w:ilvl w:val="0"/>
-          <w:numId w:val="2"/>
-        </w:numPr>
-        <w:spacing w:after="80" w:before="0" w:line="340"/>
-        <w:jc w:val="both"/>
-      </w:pPr>
-      <w:r>
-        <w:rPr>
-          <w:rFonts w:ascii="Times New Roman" w:cs="Times New Roman" w:eastAsia="Times New Roman" w:hAnsi="Times New Roman"/>
-          <w:b w:val="false"/>
-          <w:bCs w:val="false"/>
-          <w:sz w:val="26"/>
-          <w:szCs w:val="26"/>
-        </w:rPr>
-        <w:t xml:space="preserve">Khi rời một bản ghi đang sửa mà chưa lưu, hệ thống hỏi người học có bỏ thay đổi hay không.</w:t>
+          <w:b w:val="false"/>
+          <w:bCs w:val="false"/>
+          <w:sz w:val="26"/>
+          <w:szCs w:val="26"/>
+        </w:rPr>
+        <w:t xml:space="preserve">Tên không gian không được để trống.</w:t>
       </w:r>
     </w:p>
     <w:p>
@@ -7553,7 +6838,7 @@
           <w:sz w:val="26"/>
           <w:szCs w:val="26"/>
         </w:rPr>
-        <w:t xml:space="preserve">UC08: Quản lý bộ nhớ người học</w:t>
+        <w:t xml:space="preserve">UC08: Quản trị hệ thống</w:t>
       </w:r>
     </w:p>
     <w:p>
@@ -7580,7 +6865,7 @@
           <w:sz w:val="26"/>
           <w:szCs w:val="26"/>
         </w:rPr>
-        <w:t xml:space="preserve"> Người học.</w:t>
+        <w:t xml:space="preserve"> Quản trị viên.</w:t>
       </w:r>
     </w:p>
     <w:p>
@@ -7607,7 +6892,7 @@
           <w:sz w:val="26"/>
           <w:szCs w:val="26"/>
         </w:rPr>
-        <w:t xml:space="preserve"> Hệ thống tự ghi nhớ thông tin về người học qua các buổi học, như những gì đã học, mục tiêu và cách học ưa thích, để AI điều chỉnh cách hỗ trợ ở những lần sau. Người học kiểm soát được những gì hệ thống ghi nhớ. Các ca sử dụng con được thể hiện ở Hình 2.12.</w:t>
+        <w:t xml:space="preserve"> Quản trị viên tạo, xóa tài khoản cho người dùng khác và cấu hình mô hình AI dùng chung cho cả hệ thống. Các ca sử dụng con được thể hiện ở Hình 2.12.</w:t>
       </w:r>
     </w:p>
     <w:p>
@@ -7619,9 +6904,9 @@
       <w:r>
         <w:drawing>
           <wp:inline distT="0" distB="0" distL="0" distR="0">
-            <wp:extent cx="5334000" cy="1676400"/>
+            <wp:extent cx="5334000" cy="1885950"/>
             <wp:effectExtent t="0" r="0" b="0" l="0"/>
-            <wp:docPr id="12" name="Hình 2.12. Biểu đồ ca sử dụng phân rã – Quản lý bộ nhớ người học" descr="Hình 2.12. Biểu đồ ca sử dụng phân rã – Quản lý bộ nhớ người học" title="Hình 2.12. Biểu đồ ca sử dụng phân rã – Quản lý bộ nhớ người học"/>
+            <wp:docPr id="12" name="Hình 2.12. Biểu đồ ca sử dụng phân rã – Quản trị hệ thống" descr="Hình 2.12. Biểu đồ ca sử dụng phân rã – Quản trị hệ thống" title="Hình 2.12. Biểu đồ ca sử dụng phân rã – Quản trị hệ thống"/>
             <wp:cNvGraphicFramePr>
               <a:graphicFrameLocks xmlns:a="http://schemas.openxmlformats.org/drawingml/2006/main" noChangeAspect="1"/>
             </wp:cNvGraphicFramePr>
@@ -7644,737 +6929,6 @@
                   <pic:spPr bwMode="auto">
                     <a:xfrm>
                       <a:off x="0" y="0"/>
-                      <a:ext cx="5334000" cy="1676400"/>
-                    </a:xfrm>
-                    <a:prstGeom prst="rect">
-                      <a:avLst/>
-                    </a:prstGeom>
-                  </pic:spPr>
-                </pic:pic>
-              </a:graphicData>
-            </a:graphic>
-          </wp:inline>
-        </w:drawing>
-      </w:r>
-    </w:p>
-    <w:p>
-      <w:pPr>
-        <w:keepNext w:val="false"/>
-        <w:spacing w:after="200" w:before="0"/>
-        <w:jc w:val="center"/>
-      </w:pPr>
-      <w:r>
-        <w:rPr>
-          <w:rFonts w:ascii="Times New Roman" w:cs="Times New Roman" w:eastAsia="Times New Roman" w:hAnsi="Times New Roman"/>
-          <w:b/>
-          <w:bCs/>
-          <w:sz w:val="24"/>
-          <w:szCs w:val="24"/>
-        </w:rPr>
-        <w:t xml:space="preserve">Hình 2.12. Biểu đồ ca sử dụng phân rã – Quản lý bộ nhớ người học</w:t>
-      </w:r>
-    </w:p>
-    <w:p>
-      <w:pPr>
-        <w:keepNext/>
-        <w:spacing w:after="80" w:before="120" w:line="340"/>
-        <w:jc w:val="both"/>
-      </w:pPr>
-      <w:r>
-        <w:rPr>
-          <w:rFonts w:ascii="Times New Roman" w:cs="Times New Roman" w:eastAsia="Times New Roman" w:hAnsi="Times New Roman"/>
-          <w:b/>
-          <w:bCs/>
-          <w:sz w:val="26"/>
-          <w:szCs w:val="26"/>
-        </w:rPr>
-        <w:t xml:space="preserve">Chức năng:</w:t>
-      </w:r>
-    </w:p>
-    <w:p>
-      <w:pPr>
-        <w:pStyle w:val="ListParagraph"/>
-        <w:numPr>
-          <w:ilvl w:val="0"/>
-          <w:numId w:val="2"/>
-        </w:numPr>
-        <w:spacing w:after="80" w:before="0" w:line="340"/>
-        <w:jc w:val="both"/>
-      </w:pPr>
-      <w:r>
-        <w:rPr>
-          <w:rFonts w:ascii="Times New Roman" w:cs="Times New Roman" w:eastAsia="Times New Roman" w:hAnsi="Times New Roman"/>
-          <w:b/>
-          <w:bCs/>
-          <w:sz w:val="26"/>
-          <w:szCs w:val="26"/>
-        </w:rPr>
-        <w:t xml:space="preserve">Xem bộ nhớ.</w:t>
-      </w:r>
-      <w:r>
-        <w:rPr>
-          <w:rFonts w:ascii="Times New Roman" w:cs="Times New Roman" w:eastAsia="Times New Roman" w:hAnsi="Times New Roman"/>
-          <w:b w:val="false"/>
-          <w:bCs w:val="false"/>
-          <w:sz w:val="26"/>
-          <w:szCs w:val="26"/>
-        </w:rPr>
-        <w:t xml:space="preserve"> Người học xem những gì hệ thống đang ghi nhớ về mình và biết mỗi ghi nhận đến từ hoạt động nào.</w:t>
-      </w:r>
-    </w:p>
-    <w:p>
-      <w:pPr>
-        <w:pStyle w:val="ListParagraph"/>
-        <w:numPr>
-          <w:ilvl w:val="0"/>
-          <w:numId w:val="2"/>
-        </w:numPr>
-        <w:spacing w:after="80" w:before="0" w:line="340"/>
-        <w:jc w:val="both"/>
-      </w:pPr>
-      <w:r>
-        <w:rPr>
-          <w:rFonts w:ascii="Times New Roman" w:cs="Times New Roman" w:eastAsia="Times New Roman" w:hAnsi="Times New Roman"/>
-          <w:b/>
-          <w:bCs/>
-          <w:sz w:val="26"/>
-          <w:szCs w:val="26"/>
-        </w:rPr>
-        <w:t xml:space="preserve">Sửa, xóa ghi nhận.</w:t>
-      </w:r>
-      <w:r>
-        <w:rPr>
-          <w:rFonts w:ascii="Times New Roman" w:cs="Times New Roman" w:eastAsia="Times New Roman" w:hAnsi="Times New Roman"/>
-          <w:b w:val="false"/>
-          <w:bCs w:val="false"/>
-          <w:sz w:val="26"/>
-          <w:szCs w:val="26"/>
-        </w:rPr>
-        <w:t xml:space="preserve"> Người học sửa hoặc xóa những ghi nhận chưa đúng.</w:t>
-      </w:r>
-    </w:p>
-    <w:p>
-      <w:pPr>
-        <w:pStyle w:val="ListParagraph"/>
-        <w:numPr>
-          <w:ilvl w:val="0"/>
-          <w:numId w:val="2"/>
-        </w:numPr>
-        <w:spacing w:after="80" w:before="0" w:line="340"/>
-        <w:jc w:val="both"/>
-      </w:pPr>
-      <w:r>
-        <w:rPr>
-          <w:rFonts w:ascii="Times New Roman" w:cs="Times New Roman" w:eastAsia="Times New Roman" w:hAnsi="Times New Roman"/>
-          <w:b/>
-          <w:bCs/>
-          <w:sz w:val="26"/>
-          <w:szCs w:val="26"/>
-        </w:rPr>
-        <w:t xml:space="preserve">Yêu cầu AI ghi nhớ hoặc quên.</w:t>
-      </w:r>
-      <w:r>
-        <w:rPr>
-          <w:rFonts w:ascii="Times New Roman" w:cs="Times New Roman" w:eastAsia="Times New Roman" w:hAnsi="Times New Roman"/>
-          <w:b w:val="false"/>
-          <w:bCs w:val="false"/>
-          <w:sz w:val="26"/>
-          <w:szCs w:val="26"/>
-        </w:rPr>
-        <w:t xml:space="preserve"> Trong cuộc trò chuyện, người học bảo AI ghi nhớ một mong muốn, ví dụ "hãy giải thích bằng ví dụ", hoặc quên một điều đã ghi nhớ.</w:t>
-      </w:r>
-    </w:p>
-    <w:p>
-      <w:pPr>
-        <w:pStyle w:val="ListParagraph"/>
-        <w:numPr>
-          <w:ilvl w:val="0"/>
-          <w:numId w:val="2"/>
-        </w:numPr>
-        <w:spacing w:after="80" w:before="0" w:line="340"/>
-        <w:jc w:val="both"/>
-      </w:pPr>
-      <w:r>
-        <w:rPr>
-          <w:rFonts w:ascii="Times New Roman" w:cs="Times New Roman" w:eastAsia="Times New Roman" w:hAnsi="Times New Roman"/>
-          <w:b/>
-          <w:bCs/>
-          <w:sz w:val="26"/>
-          <w:szCs w:val="26"/>
-        </w:rPr>
-        <w:t xml:space="preserve">Bật, tắt bộ nhớ.</w:t>
-      </w:r>
-      <w:r>
-        <w:rPr>
-          <w:rFonts w:ascii="Times New Roman" w:cs="Times New Roman" w:eastAsia="Times New Roman" w:hAnsi="Times New Roman"/>
-          <w:b w:val="false"/>
-          <w:bCs w:val="false"/>
-          <w:sz w:val="26"/>
-          <w:szCs w:val="26"/>
-        </w:rPr>
-        <w:t xml:space="preserve"> Khi bộ nhớ tắt, hệ thống không ghi nhớ thêm và AI không dùng bộ nhớ khi trả lời.</w:t>
-      </w:r>
-    </w:p>
-    <w:p>
-      <w:pPr>
-        <w:keepNext/>
-        <w:spacing w:after="80" w:before="120" w:line="340"/>
-        <w:jc w:val="both"/>
-      </w:pPr>
-      <w:r>
-        <w:rPr>
-          <w:rFonts w:ascii="Times New Roman" w:cs="Times New Roman" w:eastAsia="Times New Roman" w:hAnsi="Times New Roman"/>
-          <w:b/>
-          <w:bCs/>
-          <w:sz w:val="26"/>
-          <w:szCs w:val="26"/>
-        </w:rPr>
-        <w:t xml:space="preserve">Quy tắc:</w:t>
-      </w:r>
-    </w:p>
-    <w:p>
-      <w:pPr>
-        <w:pStyle w:val="ListParagraph"/>
-        <w:numPr>
-          <w:ilvl w:val="0"/>
-          <w:numId w:val="2"/>
-        </w:numPr>
-        <w:spacing w:after="80" w:before="0" w:line="340"/>
-        <w:jc w:val="both"/>
-      </w:pPr>
-      <w:r>
-        <w:rPr>
-          <w:rFonts w:ascii="Times New Roman" w:cs="Times New Roman" w:eastAsia="Times New Roman" w:hAnsi="Times New Roman"/>
-          <w:b w:val="false"/>
-          <w:bCs w:val="false"/>
-          <w:sz w:val="26"/>
-          <w:szCs w:val="26"/>
-        </w:rPr>
-        <w:t xml:space="preserve">Hệ thống tự cập nhật bộ nhớ sau các buổi học; người học không phải thao tác.</w:t>
-      </w:r>
-    </w:p>
-    <w:p>
-      <w:pPr>
-        <w:pStyle w:val="ListParagraph"/>
-        <w:numPr>
-          <w:ilvl w:val="0"/>
-          <w:numId w:val="2"/>
-        </w:numPr>
-        <w:spacing w:after="80" w:before="0" w:line="340"/>
-        <w:jc w:val="both"/>
-      </w:pPr>
-      <w:r>
-        <w:rPr>
-          <w:rFonts w:ascii="Times New Roman" w:cs="Times New Roman" w:eastAsia="Times New Roman" w:hAnsi="Times New Roman"/>
-          <w:b w:val="false"/>
-          <w:bCs w:val="false"/>
-          <w:sz w:val="26"/>
-          <w:szCs w:val="26"/>
-        </w:rPr>
-        <w:t xml:space="preserve">Khi bộ nhớ đang bật, AI luôn dùng những thông tin chính về người học khi trả lời.</w:t>
-      </w:r>
-    </w:p>
-    <w:p>
-      <w:pPr>
-        <w:pStyle w:val="ListParagraph"/>
-        <w:numPr>
-          <w:ilvl w:val="0"/>
-          <w:numId w:val="2"/>
-        </w:numPr>
-        <w:spacing w:after="80" w:before="0" w:line="340"/>
-        <w:jc w:val="both"/>
-      </w:pPr>
-      <w:r>
-        <w:rPr>
-          <w:rFonts w:ascii="Times New Roman" w:cs="Times New Roman" w:eastAsia="Times New Roman" w:hAnsi="Times New Roman"/>
-          <w:b w:val="false"/>
-          <w:bCs w:val="false"/>
-          <w:sz w:val="26"/>
-          <w:szCs w:val="26"/>
-        </w:rPr>
-        <w:t xml:space="preserve">Bộ nhớ dùng chung cho mọi không gian học của người học.</w:t>
-      </w:r>
-    </w:p>
-    <w:p>
-      <w:pPr>
-        <w:pStyle w:val="ListParagraph"/>
-        <w:numPr>
-          <w:ilvl w:val="0"/>
-          <w:numId w:val="2"/>
-        </w:numPr>
-        <w:spacing w:after="80" w:before="0" w:line="340"/>
-        <w:jc w:val="both"/>
-      </w:pPr>
-      <w:r>
-        <w:rPr>
-          <w:rFonts w:ascii="Times New Roman" w:cs="Times New Roman" w:eastAsia="Times New Roman" w:hAnsi="Times New Roman"/>
-          <w:b w:val="false"/>
-          <w:bCs w:val="false"/>
-          <w:sz w:val="26"/>
-          <w:szCs w:val="26"/>
-        </w:rPr>
-        <w:t xml:space="preserve">Thông tin người học khai khi lập dàn ý một lộ trình (kiến thức đã có, mức độ muốn đạt, thời gian) thuộc về lộ trình đó (UC03).</w:t>
-      </w:r>
-    </w:p>
-    <w:p>
-      <w:pPr>
-        <w:pStyle w:val="Heading4"/>
-        <w:keepNext/>
-        <w:spacing w:after="120" w:before="280" w:line="320"/>
-        <w:jc w:val="left"/>
-      </w:pPr>
-      <w:r>
-        <w:rPr>
-          <w:rFonts w:ascii="Times New Roman" w:cs="Times New Roman" w:eastAsia="Times New Roman" w:hAnsi="Times New Roman"/>
-          <w:b/>
-          <w:bCs/>
-          <w:i/>
-          <w:iCs/>
-          <w:color w:val="000000"/>
-          <w:sz w:val="26"/>
-          <w:szCs w:val="26"/>
-        </w:rPr>
-        <w:t xml:space="preserve">UC09: Quản lý không gian học</w:t>
-      </w:r>
-    </w:p>
-    <w:p>
-      <w:pPr>
-        <w:keepNext w:val="false"/>
-        <w:spacing w:after="80" w:before="120" w:line="340"/>
-        <w:jc w:val="both"/>
-      </w:pPr>
-      <w:r>
-        <w:rPr>
-          <w:rFonts w:ascii="Times New Roman" w:cs="Times New Roman" w:eastAsia="Times New Roman" w:hAnsi="Times New Roman"/>
-          <w:b/>
-          <w:bCs/>
-          <w:sz w:val="26"/>
-          <w:szCs w:val="26"/>
-        </w:rPr>
-        <w:t xml:space="preserve">Tác nhân:</w:t>
-      </w:r>
-      <w:r>
-        <w:rPr>
-          <w:rFonts w:ascii="Times New Roman" w:cs="Times New Roman" w:eastAsia="Times New Roman" w:hAnsi="Times New Roman"/>
-          <w:b w:val="false"/>
-          <w:bCs w:val="false"/>
-          <w:sz w:val="26"/>
-          <w:szCs w:val="26"/>
-        </w:rPr>
-        <w:t xml:space="preserve"> Người học.</w:t>
-      </w:r>
-    </w:p>
-    <w:p>
-      <w:pPr>
-        <w:keepNext w:val="false"/>
-        <w:spacing w:after="80" w:before="120" w:line="340"/>
-        <w:jc w:val="both"/>
-      </w:pPr>
-      <w:r>
-        <w:rPr>
-          <w:rFonts w:ascii="Times New Roman" w:cs="Times New Roman" w:eastAsia="Times New Roman" w:hAnsi="Times New Roman"/>
-          <w:b/>
-          <w:bCs/>
-          <w:sz w:val="26"/>
-          <w:szCs w:val="26"/>
-        </w:rPr>
-        <w:t xml:space="preserve">Mô tả:</w:t>
-      </w:r>
-      <w:r>
-        <w:rPr>
-          <w:rFonts w:ascii="Times New Roman" w:cs="Times New Roman" w:eastAsia="Times New Roman" w:hAnsi="Times New Roman"/>
-          <w:b w:val="false"/>
-          <w:bCs w:val="false"/>
-          <w:sz w:val="26"/>
-          <w:szCs w:val="26"/>
-        </w:rPr>
-        <w:t xml:space="preserve"> Người học tạo các không gian học, ví dụ mỗi môn học một không gian, để cuộc trò chuyện, lộ trình, tài liệu và ghi chép của cùng một chủ đề nằm cùng nhau. Các ca sử dụng con được thể hiện ở Hình 2.13.</w:t>
-      </w:r>
-    </w:p>
-    <w:p>
-      <w:pPr>
-        <w:keepNext/>
-        <w:spacing w:after="80" w:before="160"/>
-        <w:jc w:val="center"/>
-      </w:pPr>
-      <w:r>
-        <w:drawing>
-          <wp:inline distT="0" distB="0" distL="0" distR="0">
-            <wp:extent cx="5334000" cy="2076450"/>
-            <wp:effectExtent t="0" r="0" b="0" l="0"/>
-            <wp:docPr id="13" name="Hình 2.13. Biểu đồ ca sử dụng phân rã – Quản lý không gian học" descr="Hình 2.13. Biểu đồ ca sử dụng phân rã – Quản lý không gian học" title="Hình 2.13. Biểu đồ ca sử dụng phân rã – Quản lý không gian học"/>
-            <wp:cNvGraphicFramePr>
-              <a:graphicFrameLocks xmlns:a="http://schemas.openxmlformats.org/drawingml/2006/main" noChangeAspect="1"/>
-            </wp:cNvGraphicFramePr>
-            <a:graphic xmlns:a="http://schemas.openxmlformats.org/drawingml/2006/main">
-              <a:graphicData uri="http://schemas.openxmlformats.org/drawingml/2006/picture">
-                <pic:pic xmlns:pic="http://schemas.openxmlformats.org/drawingml/2006/picture">
-                  <pic:nvPicPr>
-                    <pic:cNvPr id="0" name="" descr=""/>
-                    <pic:cNvPicPr>
-                      <a:picLocks noChangeAspect="1" noChangeArrowheads="1"/>
-                    </pic:cNvPicPr>
-                  </pic:nvPicPr>
-                  <pic:blipFill>
-                    <a:blip r:embed="rId20" cstate="none"/>
-                    <a:srcRect/>
-                    <a:stretch>
-                      <a:fillRect/>
-                    </a:stretch>
-                  </pic:blipFill>
-                  <pic:spPr bwMode="auto">
-                    <a:xfrm>
-                      <a:off x="0" y="0"/>
-                      <a:ext cx="5334000" cy="2076450"/>
-                    </a:xfrm>
-                    <a:prstGeom prst="rect">
-                      <a:avLst/>
-                    </a:prstGeom>
-                  </pic:spPr>
-                </pic:pic>
-              </a:graphicData>
-            </a:graphic>
-          </wp:inline>
-        </w:drawing>
-      </w:r>
-    </w:p>
-    <w:p>
-      <w:pPr>
-        <w:keepNext w:val="false"/>
-        <w:spacing w:after="200" w:before="0"/>
-        <w:jc w:val="center"/>
-      </w:pPr>
-      <w:r>
-        <w:rPr>
-          <w:rFonts w:ascii="Times New Roman" w:cs="Times New Roman" w:eastAsia="Times New Roman" w:hAnsi="Times New Roman"/>
-          <w:b/>
-          <w:bCs/>
-          <w:sz w:val="24"/>
-          <w:szCs w:val="24"/>
-        </w:rPr>
-        <w:t xml:space="preserve">Hình 2.13. Biểu đồ ca sử dụng phân rã – Quản lý không gian học</w:t>
-      </w:r>
-    </w:p>
-    <w:p>
-      <w:pPr>
-        <w:keepNext/>
-        <w:spacing w:after="80" w:before="120" w:line="340"/>
-        <w:jc w:val="both"/>
-      </w:pPr>
-      <w:r>
-        <w:rPr>
-          <w:rFonts w:ascii="Times New Roman" w:cs="Times New Roman" w:eastAsia="Times New Roman" w:hAnsi="Times New Roman"/>
-          <w:b/>
-          <w:bCs/>
-          <w:sz w:val="26"/>
-          <w:szCs w:val="26"/>
-        </w:rPr>
-        <w:t xml:space="preserve">Chức năng:</w:t>
-      </w:r>
-    </w:p>
-    <w:p>
-      <w:pPr>
-        <w:pStyle w:val="ListParagraph"/>
-        <w:numPr>
-          <w:ilvl w:val="0"/>
-          <w:numId w:val="2"/>
-        </w:numPr>
-        <w:spacing w:after="80" w:before="0" w:line="340"/>
-        <w:jc w:val="both"/>
-      </w:pPr>
-      <w:r>
-        <w:rPr>
-          <w:rFonts w:ascii="Times New Roman" w:cs="Times New Roman" w:eastAsia="Times New Roman" w:hAnsi="Times New Roman"/>
-          <w:b/>
-          <w:bCs/>
-          <w:sz w:val="26"/>
-          <w:szCs w:val="26"/>
-        </w:rPr>
-        <w:t xml:space="preserve">Tạo không gian học</w:t>
-      </w:r>
-      <w:r>
-        <w:rPr>
-          <w:rFonts w:ascii="Times New Roman" w:cs="Times New Roman" w:eastAsia="Times New Roman" w:hAnsi="Times New Roman"/>
-          <w:b w:val="false"/>
-          <w:bCs w:val="false"/>
-          <w:sz w:val="26"/>
-          <w:szCs w:val="26"/>
-        </w:rPr>
-        <w:t xml:space="preserve"> bằng một tên, ví dụ "Xác suất thống kê"; hệ thống chuyển người học vào không gian vừa tạo.</w:t>
-      </w:r>
-    </w:p>
-    <w:p>
-      <w:pPr>
-        <w:pStyle w:val="ListParagraph"/>
-        <w:numPr>
-          <w:ilvl w:val="0"/>
-          <w:numId w:val="2"/>
-        </w:numPr>
-        <w:spacing w:after="80" w:before="0" w:line="340"/>
-        <w:jc w:val="both"/>
-      </w:pPr>
-      <w:r>
-        <w:rPr>
-          <w:rFonts w:ascii="Times New Roman" w:cs="Times New Roman" w:eastAsia="Times New Roman" w:hAnsi="Times New Roman"/>
-          <w:b/>
-          <w:bCs/>
-          <w:sz w:val="26"/>
-          <w:szCs w:val="26"/>
-        </w:rPr>
-        <w:t xml:space="preserve">Chuyển không gian học</w:t>
-      </w:r>
-      <w:r>
-        <w:rPr>
-          <w:rFonts w:ascii="Times New Roman" w:cs="Times New Roman" w:eastAsia="Times New Roman" w:hAnsi="Times New Roman"/>
-          <w:b w:val="false"/>
-          <w:bCs w:val="false"/>
-          <w:sz w:val="26"/>
-          <w:szCs w:val="26"/>
-        </w:rPr>
-        <w:t xml:space="preserve"> để xem và làm việc với nội dung của không gian khác.</w:t>
-      </w:r>
-    </w:p>
-    <w:p>
-      <w:pPr>
-        <w:pStyle w:val="ListParagraph"/>
-        <w:numPr>
-          <w:ilvl w:val="0"/>
-          <w:numId w:val="2"/>
-        </w:numPr>
-        <w:spacing w:after="80" w:before="0" w:line="340"/>
-        <w:jc w:val="both"/>
-      </w:pPr>
-      <w:r>
-        <w:rPr>
-          <w:rFonts w:ascii="Times New Roman" w:cs="Times New Roman" w:eastAsia="Times New Roman" w:hAnsi="Times New Roman"/>
-          <w:b/>
-          <w:bCs/>
-          <w:sz w:val="26"/>
-          <w:szCs w:val="26"/>
-        </w:rPr>
-        <w:t xml:space="preserve">Xem danh sách không gian học</w:t>
-      </w:r>
-      <w:r>
-        <w:rPr>
-          <w:rFonts w:ascii="Times New Roman" w:cs="Times New Roman" w:eastAsia="Times New Roman" w:hAnsi="Times New Roman"/>
-          <w:b w:val="false"/>
-          <w:bCs w:val="false"/>
-          <w:sz w:val="26"/>
-          <w:szCs w:val="26"/>
-        </w:rPr>
-        <w:t xml:space="preserve"> trên trang quản lý không gian học. Từ đây người học đổi tên một không gian; lưu trữ và khôi phục một không gian, nội dung của không gian được lưu trữ vẫn giữ nguyên; hoặc tạo cuộc trò chuyện mới gắn với một không gian đã chọn.</w:t>
-      </w:r>
-    </w:p>
-    <w:p>
-      <w:pPr>
-        <w:keepNext/>
-        <w:spacing w:after="80" w:before="120" w:line="340"/>
-        <w:jc w:val="both"/>
-      </w:pPr>
-      <w:r>
-        <w:rPr>
-          <w:rFonts w:ascii="Times New Roman" w:cs="Times New Roman" w:eastAsia="Times New Roman" w:hAnsi="Times New Roman"/>
-          <w:b/>
-          <w:bCs/>
-          <w:sz w:val="26"/>
-          <w:szCs w:val="26"/>
-        </w:rPr>
-        <w:t xml:space="preserve">Quy tắc:</w:t>
-      </w:r>
-    </w:p>
-    <w:p>
-      <w:pPr>
-        <w:pStyle w:val="ListParagraph"/>
-        <w:numPr>
-          <w:ilvl w:val="0"/>
-          <w:numId w:val="2"/>
-        </w:numPr>
-        <w:spacing w:after="80" w:before="0" w:line="340"/>
-        <w:jc w:val="both"/>
-      </w:pPr>
-      <w:r>
-        <w:rPr>
-          <w:rFonts w:ascii="Times New Roman" w:cs="Times New Roman" w:eastAsia="Times New Roman" w:hAnsi="Times New Roman"/>
-          <w:b w:val="false"/>
-          <w:bCs w:val="false"/>
-          <w:sz w:val="26"/>
-          <w:szCs w:val="26"/>
-        </w:rPr>
-        <w:t xml:space="preserve">Nội dung được tạo ở không gian nào thì thuộc không gian đó; khi không chọn, nội dung thuộc không gian mặc định.</w:t>
-      </w:r>
-    </w:p>
-    <w:p>
-      <w:pPr>
-        <w:pStyle w:val="ListParagraph"/>
-        <w:numPr>
-          <w:ilvl w:val="0"/>
-          <w:numId w:val="2"/>
-        </w:numPr>
-        <w:spacing w:after="80" w:before="0" w:line="340"/>
-        <w:jc w:val="both"/>
-      </w:pPr>
-      <w:r>
-        <w:rPr>
-          <w:rFonts w:ascii="Times New Roman" w:cs="Times New Roman" w:eastAsia="Times New Roman" w:hAnsi="Times New Roman"/>
-          <w:b w:val="false"/>
-          <w:bCs w:val="false"/>
-          <w:sz w:val="26"/>
-          <w:szCs w:val="26"/>
-        </w:rPr>
-        <w:t xml:space="preserve">Một cuộc trò chuyện đã có tin nhắn thì không đổi sang không gian khác.</w:t>
-      </w:r>
-    </w:p>
-    <w:p>
-      <w:pPr>
-        <w:pStyle w:val="ListParagraph"/>
-        <w:numPr>
-          <w:ilvl w:val="0"/>
-          <w:numId w:val="2"/>
-        </w:numPr>
-        <w:spacing w:after="80" w:before="0" w:line="340"/>
-        <w:jc w:val="both"/>
-      </w:pPr>
-      <w:r>
-        <w:rPr>
-          <w:rFonts w:ascii="Times New Roman" w:cs="Times New Roman" w:eastAsia="Times New Roman" w:hAnsi="Times New Roman"/>
-          <w:b w:val="false"/>
-          <w:bCs w:val="false"/>
-          <w:sz w:val="26"/>
-          <w:szCs w:val="26"/>
-        </w:rPr>
-        <w:t xml:space="preserve">Các trang xem lại (sổ ghi chép, ngân hàng câu hỏi, lịch sử trò chuyện) luôn cho biết đang hiển thị nội dung của không gian nào.</w:t>
-      </w:r>
-    </w:p>
-    <w:p>
-      <w:pPr>
-        <w:pStyle w:val="ListParagraph"/>
-        <w:numPr>
-          <w:ilvl w:val="0"/>
-          <w:numId w:val="2"/>
-        </w:numPr>
-        <w:spacing w:after="80" w:before="0" w:line="340"/>
-        <w:jc w:val="both"/>
-      </w:pPr>
-      <w:r>
-        <w:rPr>
-          <w:rFonts w:ascii="Times New Roman" w:cs="Times New Roman" w:eastAsia="Times New Roman" w:hAnsi="Times New Roman"/>
-          <w:b w:val="false"/>
-          <w:bCs w:val="false"/>
-          <w:sz w:val="26"/>
-          <w:szCs w:val="26"/>
-        </w:rPr>
-        <w:t xml:space="preserve">Tên không gian không được để trống.</w:t>
-      </w:r>
-    </w:p>
-    <w:p>
-      <w:pPr>
-        <w:pStyle w:val="Heading4"/>
-        <w:keepNext/>
-        <w:spacing w:after="120" w:before="280" w:line="320"/>
-        <w:jc w:val="left"/>
-      </w:pPr>
-      <w:r>
-        <w:rPr>
-          <w:rFonts w:ascii="Times New Roman" w:cs="Times New Roman" w:eastAsia="Times New Roman" w:hAnsi="Times New Roman"/>
-          <w:b/>
-          <w:bCs/>
-          <w:i/>
-          <w:iCs/>
-          <w:color w:val="000000"/>
-          <w:sz w:val="26"/>
-          <w:szCs w:val="26"/>
-        </w:rPr>
-        <w:t xml:space="preserve">UC10: Quản trị hệ thống</w:t>
-      </w:r>
-    </w:p>
-    <w:p>
-      <w:pPr>
-        <w:keepNext w:val="false"/>
-        <w:spacing w:after="80" w:before="120" w:line="340"/>
-        <w:jc w:val="both"/>
-      </w:pPr>
-      <w:r>
-        <w:rPr>
-          <w:rFonts w:ascii="Times New Roman" w:cs="Times New Roman" w:eastAsia="Times New Roman" w:hAnsi="Times New Roman"/>
-          <w:b/>
-          <w:bCs/>
-          <w:sz w:val="26"/>
-          <w:szCs w:val="26"/>
-        </w:rPr>
-        <w:t xml:space="preserve">Tác nhân:</w:t>
-      </w:r>
-      <w:r>
-        <w:rPr>
-          <w:rFonts w:ascii="Times New Roman" w:cs="Times New Roman" w:eastAsia="Times New Roman" w:hAnsi="Times New Roman"/>
-          <w:b w:val="false"/>
-          <w:bCs w:val="false"/>
-          <w:sz w:val="26"/>
-          <w:szCs w:val="26"/>
-        </w:rPr>
-        <w:t xml:space="preserve"> Quản trị viên.</w:t>
-      </w:r>
-    </w:p>
-    <w:p>
-      <w:pPr>
-        <w:keepNext w:val="false"/>
-        <w:spacing w:after="80" w:before="120" w:line="340"/>
-        <w:jc w:val="both"/>
-      </w:pPr>
-      <w:r>
-        <w:rPr>
-          <w:rFonts w:ascii="Times New Roman" w:cs="Times New Roman" w:eastAsia="Times New Roman" w:hAnsi="Times New Roman"/>
-          <w:b/>
-          <w:bCs/>
-          <w:sz w:val="26"/>
-          <w:szCs w:val="26"/>
-        </w:rPr>
-        <w:t xml:space="preserve">Mô tả:</w:t>
-      </w:r>
-      <w:r>
-        <w:rPr>
-          <w:rFonts w:ascii="Times New Roman" w:cs="Times New Roman" w:eastAsia="Times New Roman" w:hAnsi="Times New Roman"/>
-          <w:b w:val="false"/>
-          <w:bCs w:val="false"/>
-          <w:sz w:val="26"/>
-          <w:szCs w:val="26"/>
-        </w:rPr>
-        <w:t xml:space="preserve"> Quản trị viên tạo, xóa tài khoản cho người dùng khác và cấu hình mô hình AI dùng chung cho cả hệ thống. Các ca sử dụng con được thể hiện ở Hình 2.14.</w:t>
-      </w:r>
-    </w:p>
-    <w:p>
-      <w:pPr>
-        <w:keepNext/>
-        <w:spacing w:after="80" w:before="160"/>
-        <w:jc w:val="center"/>
-      </w:pPr>
-      <w:r>
-        <w:drawing>
-          <wp:inline distT="0" distB="0" distL="0" distR="0">
-            <wp:extent cx="5334000" cy="1885950"/>
-            <wp:effectExtent t="0" r="0" b="0" l="0"/>
-            <wp:docPr id="14" name="Hình 2.14. Biểu đồ ca sử dụng phân rã – Quản trị hệ thống" descr="Hình 2.14. Biểu đồ ca sử dụng phân rã – Quản trị hệ thống" title="Hình 2.14. Biểu đồ ca sử dụng phân rã – Quản trị hệ thống"/>
-            <wp:cNvGraphicFramePr>
-              <a:graphicFrameLocks xmlns:a="http://schemas.openxmlformats.org/drawingml/2006/main" noChangeAspect="1"/>
-            </wp:cNvGraphicFramePr>
-            <a:graphic xmlns:a="http://schemas.openxmlformats.org/drawingml/2006/main">
-              <a:graphicData uri="http://schemas.openxmlformats.org/drawingml/2006/picture">
-                <pic:pic xmlns:pic="http://schemas.openxmlformats.org/drawingml/2006/picture">
-                  <pic:nvPicPr>
-                    <pic:cNvPr id="0" name="" descr=""/>
-                    <pic:cNvPicPr>
-                      <a:picLocks noChangeAspect="1" noChangeArrowheads="1"/>
-                    </pic:cNvPicPr>
-                  </pic:nvPicPr>
-                  <pic:blipFill>
-                    <a:blip r:embed="rId21" cstate="none"/>
-                    <a:srcRect/>
-                    <a:stretch>
-                      <a:fillRect/>
-                    </a:stretch>
-                  </pic:blipFill>
-                  <pic:spPr bwMode="auto">
-                    <a:xfrm>
-                      <a:off x="0" y="0"/>
                       <a:ext cx="5334000" cy="1885950"/>
                     </a:xfrm>
                     <a:prstGeom prst="rect">
@@ -8402,7 +6956,7 @@
           <w:sz w:val="24"/>
           <w:szCs w:val="24"/>
         </w:rPr>
-        <w:t xml:space="preserve">Hình 2.14. Biểu đồ ca sử dụng phân rã – Quản trị hệ thống</w:t>
+        <w:t xml:space="preserve">Hình 2.12. Biểu đồ ca sử dụng phân rã – Quản trị hệ thống</w:t>
       </w:r>
     </w:p>
     <w:p>
@@ -8858,7 +7412,7 @@
           <w:sz w:val="26"/>
           <w:szCs w:val="26"/>
         </w:rPr>
-        <w:t xml:space="preserve">Chương này đã khảo sát bài toán xây dựng một không gian học tập AI cá nhân hóa, xác định ba tác nhân và đặc tả mười ca sử dụng, trong đó học theo lộ trình là ca sử dụng trọng tâm. Các yêu cầu phi chức năng về bảo mật, tính nhất quán của việc đánh giá, độ tin cậy và khả năng thay thế thành phần cũng đã được nêu. Chương tiếp theo trình bày thiết kế hệ thống đáp ứng các yêu cầu này.</w:t>
+        <w:t xml:space="preserve">Chương này đã khảo sát bài toán xây dựng một không gian học tập AI cá nhân hóa, xác định ba tác nhân và đặc tả tám ca sử dụng, trong đó học theo lộ trình là ca sử dụng trọng tâm. Các yêu cầu phi chức năng về bảo mật, tính nhất quán của việc đánh giá, độ tin cậy và khả năng thay thế thành phần cũng đã được nêu. Chương tiếp theo trình bày thiết kế hệ thống đáp ứng các yêu cầu này.</w:t>
       </w:r>
     </w:p>
     <w:sectPr>
@@ -9237,6 +7791,139 @@
     <w:basedOn w:val="Normal"/>
     <w:qFormat/>
   </w:style>
+  <w:style w:type="paragraph" w:styleId="Caption">
+    <w:name w:val="caption"/>
+    <w:basedOn w:val="Normal"/>
+    <w:next w:val="Normal"/>
+    <w:uiPriority w:val="35"/>
+    <w:semiHidden/>
+    <w:unhideWhenUsed/>
+    <w:qFormat/>
+    <w:pPr>
+      <w:spacing w:after="200"/>
+    </w:pPr>
+    <w:rPr>
+      <w:i/>
+      <w:iCs/>
+      <w:color w:val="44546A" w:themeColor="dark2"/>
+      <w:sz w:val="18"/>
+      <w:szCs w:val="18"/>
+    </w:rPr>
+  </w:style>
+  <w:style w:type="paragraph" w:styleId="Bibliography">
+    <w:name w:val="Bibliography"/>
+    <w:basedOn w:val="Normal"/>
+    <w:next w:val="Normal"/>
+    <w:uiPriority w:val="37"/>
+    <w:unhideWhenUsed/>
+  </w:style>
+  <w:style w:type="paragraph" w:styleId="TOC1">
+    <w:name w:val="toc 1"/>
+    <w:basedOn w:val="Normal"/>
+    <w:next w:val="Normal"/>
+    <w:uiPriority w:val="39"/>
+    <w:semiHidden/>
+    <w:unhideWhenUsed/>
+    <w:pPr>
+      <w:spacing w:after="100"/>
+    </w:pPr>
+  </w:style>
+  <w:style w:type="paragraph" w:styleId="TOC2">
+    <w:name w:val="toc 2"/>
+    <w:basedOn w:val="Normal"/>
+    <w:next w:val="Normal"/>
+    <w:uiPriority w:val="39"/>
+    <w:semiHidden/>
+    <w:unhideWhenUsed/>
+    <w:pPr>
+      <w:spacing w:after="100"/>
+      <w:ind w:left="260"/>
+    </w:pPr>
+  </w:style>
+  <w:style w:type="paragraph" w:styleId="TOC3">
+    <w:name w:val="toc 3"/>
+    <w:basedOn w:val="Normal"/>
+    <w:next w:val="Normal"/>
+    <w:uiPriority w:val="39"/>
+    <w:semiHidden/>
+    <w:unhideWhenUsed/>
+    <w:pPr>
+      <w:spacing w:after="100"/>
+      <w:ind w:left="520"/>
+    </w:pPr>
+  </w:style>
+  <w:style w:type="paragraph" w:styleId="TOC4">
+    <w:name w:val="toc 4"/>
+    <w:basedOn w:val="Normal"/>
+    <w:next w:val="Normal"/>
+    <w:uiPriority w:val="39"/>
+    <w:semiHidden/>
+    <w:unhideWhenUsed/>
+    <w:pPr>
+      <w:spacing w:after="100"/>
+      <w:ind w:left="780"/>
+    </w:pPr>
+  </w:style>
+  <w:style w:type="paragraph" w:styleId="TOC5">
+    <w:name w:val="toc 5"/>
+    <w:basedOn w:val="Normal"/>
+    <w:next w:val="Normal"/>
+    <w:uiPriority w:val="39"/>
+    <w:semiHidden/>
+    <w:unhideWhenUsed/>
+    <w:pPr>
+      <w:spacing w:after="100"/>
+      <w:ind w:left="1040"/>
+    </w:pPr>
+  </w:style>
+  <w:style w:type="paragraph" w:styleId="TOC6">
+    <w:name w:val="toc 6"/>
+    <w:basedOn w:val="Normal"/>
+    <w:next w:val="Normal"/>
+    <w:uiPriority w:val="39"/>
+    <w:semiHidden/>
+    <w:unhideWhenUsed/>
+    <w:pPr>
+      <w:spacing w:after="100"/>
+      <w:ind w:left="1300"/>
+    </w:pPr>
+  </w:style>
+  <w:style w:type="paragraph" w:styleId="TOC7">
+    <w:name w:val="toc 7"/>
+    <w:basedOn w:val="Normal"/>
+    <w:next w:val="Normal"/>
+    <w:uiPriority w:val="39"/>
+    <w:semiHidden/>
+    <w:unhideWhenUsed/>
+    <w:pPr>
+      <w:spacing w:after="100"/>
+      <w:ind w:left="1560"/>
+    </w:pPr>
+  </w:style>
+  <w:style w:type="paragraph" w:styleId="TOC8">
+    <w:name w:val="toc 8"/>
+    <w:basedOn w:val="Normal"/>
+    <w:next w:val="Normal"/>
+    <w:uiPriority w:val="39"/>
+    <w:semiHidden/>
+    <w:unhideWhenUsed/>
+    <w:pPr>
+      <w:spacing w:after="100"/>
+      <w:ind w:left="1820"/>
+    </w:pPr>
+  </w:style>
+  <w:style w:type="paragraph" w:styleId="TOC9">
+    <w:name w:val="toc 9"/>
+    <w:basedOn w:val="Normal"/>
+    <w:next w:val="Normal"/>
+    <w:uiPriority w:val="39"/>
+    <w:semiHidden/>
+    <w:unhideWhenUsed/>
+    <w:pPr>
+      <w:spacing w:after="100"/>
+      <w:ind w:left="2080"/>
+    </w:pPr>
+  </w:style>
   <w:style w:type="character" w:styleId="Hyperlink">
     <w:name w:val="Hyperlink"/>
     <w:basedOn w:val="DefaultParagraphFont"/>
@@ -9320,6 +8007,13 @@
       <w:sz w:val="20"/>
       <w:szCs w:val="20"/>
     </w:rPr>
+  </w:style>
+  <w:style w:type="character" w:styleId="LineNumber">
+    <w:name w:val="line number"/>
+    <w:basedOn w:val="DefaultParagraphFont"/>
+    <w:uiPriority w:val="99"/>
+    <w:semiHidden/>
+    <w:unhideWhenUsed/>
   </w:style>
 </w:styles>
 </file>

</xml_diff>